<commit_message>
adicionando prints a docuentação
</commit_message>
<xml_diff>
--- a/MindTrack-Java.docx
+++ b/MindTrack-Java.docx
@@ -14,7 +14,7 @@
           <w:lang w:val="pt-BR"/>
         </w:rPr>
       </w:pPr>
-      <w:proofErr w:type="spellStart"/>
+      <w:bookmarkStart w:id="0" w:name="_Toc214282394"/>
       <w:r>
         <w:rPr>
           <w:rFonts w:ascii="Arial" w:hAnsi="Arial" w:cs="Arial"/>
@@ -22,18 +22,9 @@
           <w:szCs w:val="32"/>
           <w:lang w:val="pt-BR"/>
         </w:rPr>
-        <w:t>MindTrack</w:t>
+        <w:t>MindTrack – Sistema de Monitoramento Emocional Corporativo</w:t>
       </w:r>
-      <w:proofErr w:type="spellEnd"/>
-      <w:r>
-        <w:rPr>
-          <w:rFonts w:ascii="Arial" w:hAnsi="Arial" w:cs="Arial"/>
-          <w:sz w:val="32"/>
-          <w:szCs w:val="32"/>
-          <w:lang w:val="pt-BR"/>
-        </w:rPr>
-        <w:t xml:space="preserve"> – Sistema de Monitoramento Emocional Corporativo</w:t>
-      </w:r>
+      <w:bookmarkEnd w:id="0"/>
     </w:p>
     <w:p>
       <w:pPr>
@@ -45,24 +36,16 @@
           <w:szCs w:val="32"/>
         </w:rPr>
       </w:pPr>
-      <w:proofErr w:type="spellStart"/>
+      <w:bookmarkStart w:id="1" w:name="_Toc214282395"/>
       <w:r>
         <w:rPr>
           <w:rFonts w:ascii="Arial" w:hAnsi="Arial" w:cs="Arial"/>
           <w:sz w:val="32"/>
           <w:szCs w:val="32"/>
         </w:rPr>
-        <w:t>Disciplina</w:t>
+        <w:t>Disciplina: Domain Driven Design Using Java</w:t>
       </w:r>
-      <w:proofErr w:type="spellEnd"/>
-      <w:r>
-        <w:rPr>
-          <w:rFonts w:ascii="Arial" w:hAnsi="Arial" w:cs="Arial"/>
-          <w:sz w:val="32"/>
-          <w:szCs w:val="32"/>
-        </w:rPr>
-        <w:t>: Domain Driven Design Using Java</w:t>
-      </w:r>
+      <w:bookmarkEnd w:id="1"/>
     </w:p>
     <w:p>
       <w:pPr>
@@ -75,6 +58,7 @@
           <w:lang w:val="pt-BR"/>
         </w:rPr>
       </w:pPr>
+      <w:bookmarkStart w:id="2" w:name="_Toc214282396"/>
       <w:r>
         <w:rPr>
           <w:rFonts w:ascii="Arial" w:hAnsi="Arial" w:cs="Arial"/>
@@ -84,6 +68,7 @@
         </w:rPr>
         <w:t>Instituição: FIAP – Faculdade de Informática e Administração Paulista</w:t>
       </w:r>
+      <w:bookmarkEnd w:id="2"/>
       <w:r>
         <w:rPr>
           <w:rFonts w:ascii="Arial" w:hAnsi="Arial" w:cs="Arial"/>
@@ -98,6 +83,7 @@
           <w:lang w:val="pt-BR"/>
         </w:rPr>
       </w:pPr>
+      <w:bookmarkStart w:id="3" w:name="_Toc214282397"/>
       <w:r>
         <w:rPr>
           <w:rStyle w:val="Heading1Char"/>
@@ -105,6 +91,7 @@
         </w:rPr>
         <w:t>Integrantes:</w:t>
       </w:r>
+      <w:bookmarkEnd w:id="3"/>
       <w:r>
         <w:rPr>
           <w:lang w:val="pt-BR"/>
@@ -150,204 +137,1745 @@
         </w:rPr>
       </w:pPr>
     </w:p>
-    <w:p>
-      <w:pPr>
-        <w:pStyle w:val="Heading1"/>
+    <w:sdt>
+      <w:sdtPr>
         <w:rPr>
-          <w:rFonts w:ascii="Arial" w:hAnsi="Arial" w:cs="Arial"/>
           <w:lang w:val="pt-BR"/>
         </w:rPr>
-      </w:pPr>
-      <w:r>
+        <w:id w:val="-199399705"/>
+        <w:docPartObj>
+          <w:docPartGallery w:val="Table of Contents"/>
+          <w:docPartUnique/>
+        </w:docPartObj>
+      </w:sdtPr>
+      <w:sdtEndPr>
         <w:rPr>
-          <w:rFonts w:ascii="Arial" w:hAnsi="Arial" w:cs="Arial"/>
-          <w:lang w:val="pt-BR"/>
+          <w:rFonts w:asciiTheme="minorHAnsi" w:eastAsiaTheme="minorEastAsia" w:hAnsiTheme="minorHAnsi" w:cstheme="minorBidi"/>
+          <w:color w:val="auto"/>
+          <w:sz w:val="22"/>
+          <w:szCs w:val="22"/>
+          <w:lang w:val="en-US"/>
         </w:rPr>
-        <w:t>Sumário</w:t>
-      </w:r>
-    </w:p>
-    <w:p>
-      <w:pPr>
-        <w:rPr>
-          <w:rFonts w:ascii="Arial" w:hAnsi="Arial" w:cs="Arial"/>
-          <w:sz w:val="24"/>
-          <w:szCs w:val="24"/>
-          <w:lang w:val="pt-BR"/>
-        </w:rPr>
-      </w:pPr>
-      <w:r>
-        <w:rPr>
-          <w:rFonts w:ascii="Arial" w:hAnsi="Arial" w:cs="Arial"/>
-          <w:sz w:val="24"/>
-          <w:szCs w:val="24"/>
-          <w:lang w:val="pt-BR"/>
-        </w:rPr>
-        <w:t>1. Objetivo e Escopo do Projeto</w:t>
-      </w:r>
-    </w:p>
-    <w:p>
-      <w:pPr>
-        <w:rPr>
-          <w:rFonts w:ascii="Arial" w:hAnsi="Arial" w:cs="Arial"/>
-          <w:sz w:val="24"/>
-          <w:szCs w:val="24"/>
-          <w:lang w:val="pt-BR"/>
-        </w:rPr>
-      </w:pPr>
-      <w:r>
-        <w:rPr>
-          <w:rFonts w:ascii="Arial" w:hAnsi="Arial" w:cs="Arial"/>
-          <w:sz w:val="24"/>
-          <w:szCs w:val="24"/>
-          <w:lang w:val="pt-BR"/>
-        </w:rPr>
-        <w:t>2. Descrição da Solução Proposta</w:t>
-      </w:r>
-    </w:p>
-    <w:p>
-      <w:pPr>
-        <w:rPr>
-          <w:rFonts w:ascii="Arial" w:hAnsi="Arial" w:cs="Arial"/>
-          <w:sz w:val="24"/>
-          <w:szCs w:val="24"/>
-          <w:lang w:val="pt-BR"/>
-        </w:rPr>
-      </w:pPr>
-      <w:r>
-        <w:rPr>
-          <w:rFonts w:ascii="Arial" w:hAnsi="Arial" w:cs="Arial"/>
-          <w:sz w:val="24"/>
-          <w:szCs w:val="24"/>
-          <w:lang w:val="pt-BR"/>
-        </w:rPr>
-        <w:t>3. Funcionalidades Principais Implementadas</w:t>
-      </w:r>
-    </w:p>
-    <w:p>
-      <w:pPr>
-        <w:rPr>
-          <w:rFonts w:ascii="Arial" w:hAnsi="Arial" w:cs="Arial"/>
-          <w:sz w:val="24"/>
-          <w:szCs w:val="24"/>
-          <w:lang w:val="pt-BR"/>
-        </w:rPr>
-      </w:pPr>
-      <w:r>
-        <w:rPr>
-          <w:rFonts w:ascii="Arial" w:hAnsi="Arial" w:cs="Arial"/>
-          <w:sz w:val="24"/>
-          <w:szCs w:val="24"/>
-          <w:lang w:val="pt-BR"/>
-        </w:rPr>
-        <w:t>4. Tabe</w:t>
-      </w:r>
-      <w:r>
-        <w:rPr>
-          <w:rFonts w:ascii="Arial" w:hAnsi="Arial" w:cs="Arial"/>
-          <w:sz w:val="24"/>
-          <w:szCs w:val="24"/>
-          <w:lang w:val="pt-BR"/>
-        </w:rPr>
-        <w:t xml:space="preserve">la de </w:t>
-      </w:r>
-      <w:proofErr w:type="spellStart"/>
-      <w:r>
-        <w:rPr>
-          <w:rFonts w:ascii="Arial" w:hAnsi="Arial" w:cs="Arial"/>
-          <w:sz w:val="24"/>
-          <w:szCs w:val="24"/>
-          <w:lang w:val="pt-BR"/>
-        </w:rPr>
-        <w:t>Endpoints</w:t>
-      </w:r>
-      <w:proofErr w:type="spellEnd"/>
-      <w:r>
-        <w:rPr>
-          <w:rFonts w:ascii="Arial" w:hAnsi="Arial" w:cs="Arial"/>
-          <w:sz w:val="24"/>
-          <w:szCs w:val="24"/>
-          <w:lang w:val="pt-BR"/>
-        </w:rPr>
-        <w:t xml:space="preserve"> (API </w:t>
-      </w:r>
-      <w:proofErr w:type="spellStart"/>
-      <w:r>
-        <w:rPr>
-          <w:rFonts w:ascii="Arial" w:hAnsi="Arial" w:cs="Arial"/>
-          <w:sz w:val="24"/>
-          <w:szCs w:val="24"/>
-          <w:lang w:val="pt-BR"/>
-        </w:rPr>
-        <w:t>RESTful</w:t>
-      </w:r>
-      <w:proofErr w:type="spellEnd"/>
-      <w:r>
-        <w:rPr>
-          <w:rFonts w:ascii="Arial" w:hAnsi="Arial" w:cs="Arial"/>
-          <w:sz w:val="24"/>
-          <w:szCs w:val="24"/>
-          <w:lang w:val="pt-BR"/>
-        </w:rPr>
-        <w:t>)</w:t>
-      </w:r>
-    </w:p>
-    <w:p>
-      <w:pPr>
-        <w:rPr>
-          <w:rFonts w:ascii="Arial" w:hAnsi="Arial" w:cs="Arial"/>
-          <w:sz w:val="24"/>
-          <w:szCs w:val="24"/>
-          <w:lang w:val="pt-BR"/>
-        </w:rPr>
-      </w:pPr>
-      <w:r>
-        <w:rPr>
-          <w:rFonts w:ascii="Arial" w:hAnsi="Arial" w:cs="Arial"/>
-          <w:sz w:val="24"/>
-          <w:szCs w:val="24"/>
-          <w:lang w:val="pt-BR"/>
-        </w:rPr>
-        <w:t>5. Protótipo – Prints das Telas Implementadas</w:t>
-      </w:r>
-    </w:p>
-    <w:p>
-      <w:pPr>
-        <w:rPr>
-          <w:rFonts w:ascii="Arial" w:hAnsi="Arial" w:cs="Arial"/>
-          <w:sz w:val="24"/>
-          <w:szCs w:val="24"/>
-          <w:lang w:val="pt-BR"/>
-        </w:rPr>
-      </w:pPr>
-      <w:r>
-        <w:rPr>
-          <w:rFonts w:ascii="Arial" w:hAnsi="Arial" w:cs="Arial"/>
-          <w:sz w:val="24"/>
-          <w:szCs w:val="24"/>
-          <w:lang w:val="pt-BR"/>
-        </w:rPr>
-        <w:t>6. Modelo Entidade-Relacionamento (MER)</w:t>
-      </w:r>
-    </w:p>
-    <w:p>
-      <w:pPr>
-        <w:rPr>
-          <w:rFonts w:ascii="Arial" w:hAnsi="Arial" w:cs="Arial"/>
-          <w:sz w:val="24"/>
-          <w:szCs w:val="24"/>
-          <w:lang w:val="pt-BR"/>
-        </w:rPr>
-      </w:pPr>
-      <w:r>
-        <w:rPr>
-          <w:rFonts w:ascii="Arial" w:hAnsi="Arial" w:cs="Arial"/>
-          <w:sz w:val="24"/>
-          <w:szCs w:val="24"/>
-          <w:lang w:val="pt-BR"/>
-        </w:rPr>
-        <w:t>7. Diagrama de Classes</w:t>
-      </w:r>
-    </w:p>
+      </w:sdtEndPr>
+      <w:sdtContent>
+        <w:p>
+          <w:pPr>
+            <w:pStyle w:val="TOCHeading"/>
+            <w:rPr>
+              <w:rFonts w:ascii="Arial" w:hAnsi="Arial" w:cs="Arial"/>
+              <w:sz w:val="24"/>
+              <w:szCs w:val="24"/>
+            </w:rPr>
+          </w:pPr>
+          <w:r>
+            <w:rPr>
+              <w:rFonts w:ascii="Arial" w:hAnsi="Arial" w:cs="Arial"/>
+              <w:sz w:val="24"/>
+              <w:szCs w:val="24"/>
+              <w:lang w:val="pt-BR"/>
+            </w:rPr>
+            <w:t>Sumário</w:t>
+          </w:r>
+        </w:p>
+        <w:p>
+          <w:pPr>
+            <w:pStyle w:val="TOC1"/>
+            <w:tabs>
+              <w:tab w:val="right" w:leader="dot" w:pos="8630"/>
+            </w:tabs>
+            <w:rPr>
+              <w:rFonts w:ascii="Arial" w:hAnsi="Arial" w:cs="Arial"/>
+              <w:noProof/>
+              <w:sz w:val="24"/>
+              <w:szCs w:val="24"/>
+              <w:lang w:val="pt-BR" w:eastAsia="pt-BR"/>
+            </w:rPr>
+          </w:pPr>
+          <w:r>
+            <w:rPr>
+              <w:rFonts w:ascii="Arial" w:hAnsi="Arial" w:cs="Arial"/>
+              <w:sz w:val="24"/>
+              <w:szCs w:val="24"/>
+            </w:rPr>
+            <w:fldChar w:fldCharType="begin"/>
+          </w:r>
+          <w:r>
+            <w:rPr>
+              <w:rFonts w:ascii="Arial" w:hAnsi="Arial" w:cs="Arial"/>
+              <w:sz w:val="24"/>
+              <w:szCs w:val="24"/>
+            </w:rPr>
+            <w:instrText xml:space="preserve"> TOC \o "1-3" \h \z \u </w:instrText>
+          </w:r>
+          <w:r>
+            <w:rPr>
+              <w:rFonts w:ascii="Arial" w:hAnsi="Arial" w:cs="Arial"/>
+              <w:sz w:val="24"/>
+              <w:szCs w:val="24"/>
+            </w:rPr>
+            <w:fldChar w:fldCharType="separate"/>
+          </w:r>
+          <w:hyperlink w:anchor="_Toc214282394" w:history="1">
+            <w:r>
+              <w:rPr>
+                <w:rStyle w:val="Hyperlink"/>
+                <w:rFonts w:ascii="Arial" w:hAnsi="Arial" w:cs="Arial"/>
+                <w:noProof/>
+                <w:sz w:val="24"/>
+                <w:szCs w:val="24"/>
+                <w:lang w:val="pt-BR"/>
+              </w:rPr>
+              <w:t>MindTrack – Sistema de Monitoramento Emocional Corporativo</w:t>
+            </w:r>
+            <w:r>
+              <w:rPr>
+                <w:rFonts w:ascii="Arial" w:hAnsi="Arial" w:cs="Arial"/>
+                <w:noProof/>
+                <w:webHidden/>
+                <w:sz w:val="24"/>
+                <w:szCs w:val="24"/>
+              </w:rPr>
+              <w:tab/>
+            </w:r>
+            <w:r>
+              <w:rPr>
+                <w:rFonts w:ascii="Arial" w:hAnsi="Arial" w:cs="Arial"/>
+                <w:noProof/>
+                <w:webHidden/>
+                <w:sz w:val="24"/>
+                <w:szCs w:val="24"/>
+              </w:rPr>
+              <w:fldChar w:fldCharType="begin"/>
+            </w:r>
+            <w:r>
+              <w:rPr>
+                <w:rFonts w:ascii="Arial" w:hAnsi="Arial" w:cs="Arial"/>
+                <w:noProof/>
+                <w:webHidden/>
+                <w:sz w:val="24"/>
+                <w:szCs w:val="24"/>
+              </w:rPr>
+              <w:instrText xml:space="preserve"> PAGEREF _Toc214282394 \h </w:instrText>
+            </w:r>
+            <w:r>
+              <w:rPr>
+                <w:rFonts w:ascii="Arial" w:hAnsi="Arial" w:cs="Arial"/>
+                <w:noProof/>
+                <w:webHidden/>
+                <w:sz w:val="24"/>
+                <w:szCs w:val="24"/>
+              </w:rPr>
+            </w:r>
+            <w:r>
+              <w:rPr>
+                <w:rFonts w:ascii="Arial" w:hAnsi="Arial" w:cs="Arial"/>
+                <w:noProof/>
+                <w:webHidden/>
+                <w:sz w:val="24"/>
+                <w:szCs w:val="24"/>
+              </w:rPr>
+              <w:fldChar w:fldCharType="separate"/>
+            </w:r>
+            <w:r>
+              <w:rPr>
+                <w:rFonts w:ascii="Arial" w:hAnsi="Arial" w:cs="Arial"/>
+                <w:noProof/>
+                <w:webHidden/>
+                <w:sz w:val="24"/>
+                <w:szCs w:val="24"/>
+              </w:rPr>
+              <w:t>1</w:t>
+            </w:r>
+            <w:r>
+              <w:rPr>
+                <w:rFonts w:ascii="Arial" w:hAnsi="Arial" w:cs="Arial"/>
+                <w:noProof/>
+                <w:webHidden/>
+                <w:sz w:val="24"/>
+                <w:szCs w:val="24"/>
+              </w:rPr>
+              <w:fldChar w:fldCharType="end"/>
+            </w:r>
+          </w:hyperlink>
+        </w:p>
+        <w:p>
+          <w:pPr>
+            <w:pStyle w:val="TOC1"/>
+            <w:tabs>
+              <w:tab w:val="right" w:leader="dot" w:pos="8630"/>
+            </w:tabs>
+            <w:rPr>
+              <w:rFonts w:ascii="Arial" w:hAnsi="Arial" w:cs="Arial"/>
+              <w:noProof/>
+              <w:sz w:val="24"/>
+              <w:szCs w:val="24"/>
+              <w:lang w:val="pt-BR" w:eastAsia="pt-BR"/>
+            </w:rPr>
+          </w:pPr>
+          <w:hyperlink w:anchor="_Toc214282395" w:history="1">
+            <w:r>
+              <w:rPr>
+                <w:rStyle w:val="Hyperlink"/>
+                <w:rFonts w:ascii="Arial" w:hAnsi="Arial" w:cs="Arial"/>
+                <w:noProof/>
+                <w:sz w:val="24"/>
+                <w:szCs w:val="24"/>
+              </w:rPr>
+              <w:t>Disciplina: Domain Driven Design Using Java</w:t>
+            </w:r>
+            <w:r>
+              <w:rPr>
+                <w:rFonts w:ascii="Arial" w:hAnsi="Arial" w:cs="Arial"/>
+                <w:noProof/>
+                <w:webHidden/>
+                <w:sz w:val="24"/>
+                <w:szCs w:val="24"/>
+              </w:rPr>
+              <w:tab/>
+            </w:r>
+            <w:r>
+              <w:rPr>
+                <w:rFonts w:ascii="Arial" w:hAnsi="Arial" w:cs="Arial"/>
+                <w:noProof/>
+                <w:webHidden/>
+                <w:sz w:val="24"/>
+                <w:szCs w:val="24"/>
+              </w:rPr>
+              <w:fldChar w:fldCharType="begin"/>
+            </w:r>
+            <w:r>
+              <w:rPr>
+                <w:rFonts w:ascii="Arial" w:hAnsi="Arial" w:cs="Arial"/>
+                <w:noProof/>
+                <w:webHidden/>
+                <w:sz w:val="24"/>
+                <w:szCs w:val="24"/>
+              </w:rPr>
+              <w:instrText xml:space="preserve"> PAGEREF _Toc214282395 \h </w:instrText>
+            </w:r>
+            <w:r>
+              <w:rPr>
+                <w:rFonts w:ascii="Arial" w:hAnsi="Arial" w:cs="Arial"/>
+                <w:noProof/>
+                <w:webHidden/>
+                <w:sz w:val="24"/>
+                <w:szCs w:val="24"/>
+              </w:rPr>
+            </w:r>
+            <w:r>
+              <w:rPr>
+                <w:rFonts w:ascii="Arial" w:hAnsi="Arial" w:cs="Arial"/>
+                <w:noProof/>
+                <w:webHidden/>
+                <w:sz w:val="24"/>
+                <w:szCs w:val="24"/>
+              </w:rPr>
+              <w:fldChar w:fldCharType="separate"/>
+            </w:r>
+            <w:r>
+              <w:rPr>
+                <w:rFonts w:ascii="Arial" w:hAnsi="Arial" w:cs="Arial"/>
+                <w:noProof/>
+                <w:webHidden/>
+                <w:sz w:val="24"/>
+                <w:szCs w:val="24"/>
+              </w:rPr>
+              <w:t>1</w:t>
+            </w:r>
+            <w:r>
+              <w:rPr>
+                <w:rFonts w:ascii="Arial" w:hAnsi="Arial" w:cs="Arial"/>
+                <w:noProof/>
+                <w:webHidden/>
+                <w:sz w:val="24"/>
+                <w:szCs w:val="24"/>
+              </w:rPr>
+              <w:fldChar w:fldCharType="end"/>
+            </w:r>
+          </w:hyperlink>
+        </w:p>
+        <w:p>
+          <w:pPr>
+            <w:pStyle w:val="TOC1"/>
+            <w:tabs>
+              <w:tab w:val="right" w:leader="dot" w:pos="8630"/>
+            </w:tabs>
+            <w:rPr>
+              <w:rFonts w:ascii="Arial" w:hAnsi="Arial" w:cs="Arial"/>
+              <w:noProof/>
+              <w:sz w:val="24"/>
+              <w:szCs w:val="24"/>
+              <w:lang w:val="pt-BR" w:eastAsia="pt-BR"/>
+            </w:rPr>
+          </w:pPr>
+          <w:hyperlink w:anchor="_Toc214282396" w:history="1">
+            <w:r>
+              <w:rPr>
+                <w:rStyle w:val="Hyperlink"/>
+                <w:rFonts w:ascii="Arial" w:hAnsi="Arial" w:cs="Arial"/>
+                <w:noProof/>
+                <w:sz w:val="24"/>
+                <w:szCs w:val="24"/>
+                <w:lang w:val="pt-BR"/>
+              </w:rPr>
+              <w:t>Instituição: FIAP – Faculdade de Informática e Administração Paulista</w:t>
+            </w:r>
+            <w:r>
+              <w:rPr>
+                <w:rFonts w:ascii="Arial" w:hAnsi="Arial" w:cs="Arial"/>
+                <w:noProof/>
+                <w:webHidden/>
+                <w:sz w:val="24"/>
+                <w:szCs w:val="24"/>
+              </w:rPr>
+              <w:tab/>
+            </w:r>
+            <w:r>
+              <w:rPr>
+                <w:rFonts w:ascii="Arial" w:hAnsi="Arial" w:cs="Arial"/>
+                <w:noProof/>
+                <w:webHidden/>
+                <w:sz w:val="24"/>
+                <w:szCs w:val="24"/>
+              </w:rPr>
+              <w:fldChar w:fldCharType="begin"/>
+            </w:r>
+            <w:r>
+              <w:rPr>
+                <w:rFonts w:ascii="Arial" w:hAnsi="Arial" w:cs="Arial"/>
+                <w:noProof/>
+                <w:webHidden/>
+                <w:sz w:val="24"/>
+                <w:szCs w:val="24"/>
+              </w:rPr>
+              <w:instrText xml:space="preserve"> PAGEREF _Toc214282396 \h </w:instrText>
+            </w:r>
+            <w:r>
+              <w:rPr>
+                <w:rFonts w:ascii="Arial" w:hAnsi="Arial" w:cs="Arial"/>
+                <w:noProof/>
+                <w:webHidden/>
+                <w:sz w:val="24"/>
+                <w:szCs w:val="24"/>
+              </w:rPr>
+            </w:r>
+            <w:r>
+              <w:rPr>
+                <w:rFonts w:ascii="Arial" w:hAnsi="Arial" w:cs="Arial"/>
+                <w:noProof/>
+                <w:webHidden/>
+                <w:sz w:val="24"/>
+                <w:szCs w:val="24"/>
+              </w:rPr>
+              <w:fldChar w:fldCharType="separate"/>
+            </w:r>
+            <w:r>
+              <w:rPr>
+                <w:rFonts w:ascii="Arial" w:hAnsi="Arial" w:cs="Arial"/>
+                <w:noProof/>
+                <w:webHidden/>
+                <w:sz w:val="24"/>
+                <w:szCs w:val="24"/>
+              </w:rPr>
+              <w:t>1</w:t>
+            </w:r>
+            <w:r>
+              <w:rPr>
+                <w:rFonts w:ascii="Arial" w:hAnsi="Arial" w:cs="Arial"/>
+                <w:noProof/>
+                <w:webHidden/>
+                <w:sz w:val="24"/>
+                <w:szCs w:val="24"/>
+              </w:rPr>
+              <w:fldChar w:fldCharType="end"/>
+            </w:r>
+          </w:hyperlink>
+        </w:p>
+        <w:p>
+          <w:pPr>
+            <w:pStyle w:val="TOC1"/>
+            <w:tabs>
+              <w:tab w:val="right" w:leader="dot" w:pos="8630"/>
+            </w:tabs>
+            <w:rPr>
+              <w:rFonts w:ascii="Arial" w:hAnsi="Arial" w:cs="Arial"/>
+              <w:noProof/>
+              <w:sz w:val="24"/>
+              <w:szCs w:val="24"/>
+              <w:lang w:val="pt-BR" w:eastAsia="pt-BR"/>
+            </w:rPr>
+          </w:pPr>
+          <w:hyperlink w:anchor="_Toc214282397" w:history="1">
+            <w:r>
+              <w:rPr>
+                <w:rStyle w:val="Hyperlink"/>
+                <w:rFonts w:ascii="Arial" w:hAnsi="Arial" w:cs="Arial"/>
+                <w:noProof/>
+                <w:sz w:val="24"/>
+                <w:szCs w:val="24"/>
+                <w:lang w:val="pt-BR"/>
+              </w:rPr>
+              <w:t>Integrantes:</w:t>
+            </w:r>
+            <w:r>
+              <w:rPr>
+                <w:rFonts w:ascii="Arial" w:hAnsi="Arial" w:cs="Arial"/>
+                <w:noProof/>
+                <w:webHidden/>
+                <w:sz w:val="24"/>
+                <w:szCs w:val="24"/>
+              </w:rPr>
+              <w:tab/>
+            </w:r>
+            <w:r>
+              <w:rPr>
+                <w:rFonts w:ascii="Arial" w:hAnsi="Arial" w:cs="Arial"/>
+                <w:noProof/>
+                <w:webHidden/>
+                <w:sz w:val="24"/>
+                <w:szCs w:val="24"/>
+              </w:rPr>
+              <w:fldChar w:fldCharType="begin"/>
+            </w:r>
+            <w:r>
+              <w:rPr>
+                <w:rFonts w:ascii="Arial" w:hAnsi="Arial" w:cs="Arial"/>
+                <w:noProof/>
+                <w:webHidden/>
+                <w:sz w:val="24"/>
+                <w:szCs w:val="24"/>
+              </w:rPr>
+              <w:instrText xml:space="preserve"> PAGEREF _Toc214282397 \h </w:instrText>
+            </w:r>
+            <w:r>
+              <w:rPr>
+                <w:rFonts w:ascii="Arial" w:hAnsi="Arial" w:cs="Arial"/>
+                <w:noProof/>
+                <w:webHidden/>
+                <w:sz w:val="24"/>
+                <w:szCs w:val="24"/>
+              </w:rPr>
+            </w:r>
+            <w:r>
+              <w:rPr>
+                <w:rFonts w:ascii="Arial" w:hAnsi="Arial" w:cs="Arial"/>
+                <w:noProof/>
+                <w:webHidden/>
+                <w:sz w:val="24"/>
+                <w:szCs w:val="24"/>
+              </w:rPr>
+              <w:fldChar w:fldCharType="separate"/>
+            </w:r>
+            <w:r>
+              <w:rPr>
+                <w:rFonts w:ascii="Arial" w:hAnsi="Arial" w:cs="Arial"/>
+                <w:noProof/>
+                <w:webHidden/>
+                <w:sz w:val="24"/>
+                <w:szCs w:val="24"/>
+              </w:rPr>
+              <w:t>1</w:t>
+            </w:r>
+            <w:r>
+              <w:rPr>
+                <w:rFonts w:ascii="Arial" w:hAnsi="Arial" w:cs="Arial"/>
+                <w:noProof/>
+                <w:webHidden/>
+                <w:sz w:val="24"/>
+                <w:szCs w:val="24"/>
+              </w:rPr>
+              <w:fldChar w:fldCharType="end"/>
+            </w:r>
+          </w:hyperlink>
+        </w:p>
+        <w:p>
+          <w:pPr>
+            <w:pStyle w:val="TOC2"/>
+            <w:tabs>
+              <w:tab w:val="right" w:leader="dot" w:pos="8630"/>
+            </w:tabs>
+            <w:rPr>
+              <w:rFonts w:ascii="Arial" w:hAnsi="Arial" w:cs="Arial"/>
+              <w:noProof/>
+              <w:sz w:val="24"/>
+              <w:szCs w:val="24"/>
+              <w:lang w:val="pt-BR" w:eastAsia="pt-BR"/>
+            </w:rPr>
+          </w:pPr>
+          <w:hyperlink w:anchor="_Toc214282398" w:history="1">
+            <w:r>
+              <w:rPr>
+                <w:rStyle w:val="Hyperlink"/>
+                <w:rFonts w:ascii="Arial" w:hAnsi="Arial" w:cs="Arial"/>
+                <w:noProof/>
+                <w:sz w:val="24"/>
+                <w:szCs w:val="24"/>
+                <w:lang w:val="pt-BR"/>
+              </w:rPr>
+              <w:t>Link do</w:t>
+            </w:r>
+            <w:r>
+              <w:rPr>
+                <w:rStyle w:val="Hyperlink"/>
+                <w:rFonts w:ascii="Arial" w:hAnsi="Arial" w:cs="Arial"/>
+                <w:noProof/>
+                <w:sz w:val="24"/>
+                <w:szCs w:val="24"/>
+                <w:lang w:val="pt-BR"/>
+              </w:rPr>
+              <w:t xml:space="preserve"> </w:t>
+            </w:r>
+            <w:r>
+              <w:rPr>
+                <w:rStyle w:val="Hyperlink"/>
+                <w:rFonts w:ascii="Arial" w:hAnsi="Arial" w:cs="Arial"/>
+                <w:noProof/>
+                <w:sz w:val="24"/>
+                <w:szCs w:val="24"/>
+                <w:lang w:val="pt-BR"/>
+              </w:rPr>
+              <w:t>vídeo:</w:t>
+            </w:r>
+            <w:r>
+              <w:rPr>
+                <w:rFonts w:ascii="Arial" w:hAnsi="Arial" w:cs="Arial"/>
+                <w:noProof/>
+                <w:webHidden/>
+                <w:sz w:val="24"/>
+                <w:szCs w:val="24"/>
+              </w:rPr>
+              <w:tab/>
+            </w:r>
+            <w:r>
+              <w:rPr>
+                <w:rFonts w:ascii="Arial" w:hAnsi="Arial" w:cs="Arial"/>
+                <w:noProof/>
+                <w:webHidden/>
+                <w:sz w:val="24"/>
+                <w:szCs w:val="24"/>
+              </w:rPr>
+              <w:fldChar w:fldCharType="begin"/>
+            </w:r>
+            <w:r>
+              <w:rPr>
+                <w:rFonts w:ascii="Arial" w:hAnsi="Arial" w:cs="Arial"/>
+                <w:noProof/>
+                <w:webHidden/>
+                <w:sz w:val="24"/>
+                <w:szCs w:val="24"/>
+              </w:rPr>
+              <w:instrText xml:space="preserve"> PAGEREF _Toc214282398 \h </w:instrText>
+            </w:r>
+            <w:r>
+              <w:rPr>
+                <w:rFonts w:ascii="Arial" w:hAnsi="Arial" w:cs="Arial"/>
+                <w:noProof/>
+                <w:webHidden/>
+                <w:sz w:val="24"/>
+                <w:szCs w:val="24"/>
+              </w:rPr>
+            </w:r>
+            <w:r>
+              <w:rPr>
+                <w:rFonts w:ascii="Arial" w:hAnsi="Arial" w:cs="Arial"/>
+                <w:noProof/>
+                <w:webHidden/>
+                <w:sz w:val="24"/>
+                <w:szCs w:val="24"/>
+              </w:rPr>
+              <w:fldChar w:fldCharType="separate"/>
+            </w:r>
+            <w:r>
+              <w:rPr>
+                <w:rFonts w:ascii="Arial" w:hAnsi="Arial" w:cs="Arial"/>
+                <w:noProof/>
+                <w:webHidden/>
+                <w:sz w:val="24"/>
+                <w:szCs w:val="24"/>
+              </w:rPr>
+              <w:t>2</w:t>
+            </w:r>
+            <w:r>
+              <w:rPr>
+                <w:rFonts w:ascii="Arial" w:hAnsi="Arial" w:cs="Arial"/>
+                <w:noProof/>
+                <w:webHidden/>
+                <w:sz w:val="24"/>
+                <w:szCs w:val="24"/>
+              </w:rPr>
+              <w:fldChar w:fldCharType="end"/>
+            </w:r>
+          </w:hyperlink>
+        </w:p>
+        <w:p>
+          <w:pPr>
+            <w:pStyle w:val="TOC2"/>
+            <w:tabs>
+              <w:tab w:val="right" w:leader="dot" w:pos="8630"/>
+            </w:tabs>
+            <w:rPr>
+              <w:rFonts w:ascii="Arial" w:hAnsi="Arial" w:cs="Arial"/>
+              <w:noProof/>
+              <w:sz w:val="24"/>
+              <w:szCs w:val="24"/>
+              <w:lang w:val="pt-BR" w:eastAsia="pt-BR"/>
+            </w:rPr>
+          </w:pPr>
+          <w:hyperlink w:anchor="_Toc214282399" w:history="1">
+            <w:r>
+              <w:rPr>
+                <w:rStyle w:val="Hyperlink"/>
+                <w:rFonts w:ascii="Arial" w:hAnsi="Arial" w:cs="Arial"/>
+                <w:noProof/>
+                <w:sz w:val="24"/>
+                <w:szCs w:val="24"/>
+                <w:lang w:val="pt-BR"/>
+              </w:rPr>
+              <w:t>1. Objetivo e Escopo do Projeto</w:t>
+            </w:r>
+            <w:r>
+              <w:rPr>
+                <w:rFonts w:ascii="Arial" w:hAnsi="Arial" w:cs="Arial"/>
+                <w:noProof/>
+                <w:webHidden/>
+                <w:sz w:val="24"/>
+                <w:szCs w:val="24"/>
+              </w:rPr>
+              <w:tab/>
+            </w:r>
+            <w:r>
+              <w:rPr>
+                <w:rFonts w:ascii="Arial" w:hAnsi="Arial" w:cs="Arial"/>
+                <w:noProof/>
+                <w:webHidden/>
+                <w:sz w:val="24"/>
+                <w:szCs w:val="24"/>
+              </w:rPr>
+              <w:fldChar w:fldCharType="begin"/>
+            </w:r>
+            <w:r>
+              <w:rPr>
+                <w:rFonts w:ascii="Arial" w:hAnsi="Arial" w:cs="Arial"/>
+                <w:noProof/>
+                <w:webHidden/>
+                <w:sz w:val="24"/>
+                <w:szCs w:val="24"/>
+              </w:rPr>
+              <w:instrText xml:space="preserve"> PAGEREF _Toc214282399 \h </w:instrText>
+            </w:r>
+            <w:r>
+              <w:rPr>
+                <w:rFonts w:ascii="Arial" w:hAnsi="Arial" w:cs="Arial"/>
+                <w:noProof/>
+                <w:webHidden/>
+                <w:sz w:val="24"/>
+                <w:szCs w:val="24"/>
+              </w:rPr>
+            </w:r>
+            <w:r>
+              <w:rPr>
+                <w:rFonts w:ascii="Arial" w:hAnsi="Arial" w:cs="Arial"/>
+                <w:noProof/>
+                <w:webHidden/>
+                <w:sz w:val="24"/>
+                <w:szCs w:val="24"/>
+              </w:rPr>
+              <w:fldChar w:fldCharType="separate"/>
+            </w:r>
+            <w:r>
+              <w:rPr>
+                <w:rFonts w:ascii="Arial" w:hAnsi="Arial" w:cs="Arial"/>
+                <w:noProof/>
+                <w:webHidden/>
+                <w:sz w:val="24"/>
+                <w:szCs w:val="24"/>
+              </w:rPr>
+              <w:t>2</w:t>
+            </w:r>
+            <w:r>
+              <w:rPr>
+                <w:rFonts w:ascii="Arial" w:hAnsi="Arial" w:cs="Arial"/>
+                <w:noProof/>
+                <w:webHidden/>
+                <w:sz w:val="24"/>
+                <w:szCs w:val="24"/>
+              </w:rPr>
+              <w:fldChar w:fldCharType="end"/>
+            </w:r>
+          </w:hyperlink>
+        </w:p>
+        <w:p>
+          <w:pPr>
+            <w:pStyle w:val="TOC1"/>
+            <w:tabs>
+              <w:tab w:val="right" w:leader="dot" w:pos="8630"/>
+            </w:tabs>
+            <w:rPr>
+              <w:rFonts w:ascii="Arial" w:hAnsi="Arial" w:cs="Arial"/>
+              <w:noProof/>
+              <w:sz w:val="24"/>
+              <w:szCs w:val="24"/>
+              <w:lang w:val="pt-BR" w:eastAsia="pt-BR"/>
+            </w:rPr>
+          </w:pPr>
+          <w:hyperlink w:anchor="_Toc214282400" w:history="1">
+            <w:r>
+              <w:rPr>
+                <w:rStyle w:val="Hyperlink"/>
+                <w:rFonts w:ascii="Arial" w:hAnsi="Arial" w:cs="Arial"/>
+                <w:noProof/>
+                <w:sz w:val="24"/>
+                <w:szCs w:val="24"/>
+                <w:lang w:val="pt-BR"/>
+              </w:rPr>
+              <w:t>2. Breve Descrição das Principais Funcionalidades da Solução</w:t>
+            </w:r>
+            <w:r>
+              <w:rPr>
+                <w:rFonts w:ascii="Arial" w:hAnsi="Arial" w:cs="Arial"/>
+                <w:noProof/>
+                <w:webHidden/>
+                <w:sz w:val="24"/>
+                <w:szCs w:val="24"/>
+              </w:rPr>
+              <w:tab/>
+            </w:r>
+            <w:r>
+              <w:rPr>
+                <w:rFonts w:ascii="Arial" w:hAnsi="Arial" w:cs="Arial"/>
+                <w:noProof/>
+                <w:webHidden/>
+                <w:sz w:val="24"/>
+                <w:szCs w:val="24"/>
+              </w:rPr>
+              <w:fldChar w:fldCharType="begin"/>
+            </w:r>
+            <w:r>
+              <w:rPr>
+                <w:rFonts w:ascii="Arial" w:hAnsi="Arial" w:cs="Arial"/>
+                <w:noProof/>
+                <w:webHidden/>
+                <w:sz w:val="24"/>
+                <w:szCs w:val="24"/>
+              </w:rPr>
+              <w:instrText xml:space="preserve"> PAGEREF _Toc214282400 \h </w:instrText>
+            </w:r>
+            <w:r>
+              <w:rPr>
+                <w:rFonts w:ascii="Arial" w:hAnsi="Arial" w:cs="Arial"/>
+                <w:noProof/>
+                <w:webHidden/>
+                <w:sz w:val="24"/>
+                <w:szCs w:val="24"/>
+              </w:rPr>
+            </w:r>
+            <w:r>
+              <w:rPr>
+                <w:rFonts w:ascii="Arial" w:hAnsi="Arial" w:cs="Arial"/>
+                <w:noProof/>
+                <w:webHidden/>
+                <w:sz w:val="24"/>
+                <w:szCs w:val="24"/>
+              </w:rPr>
+              <w:fldChar w:fldCharType="separate"/>
+            </w:r>
+            <w:r>
+              <w:rPr>
+                <w:rFonts w:ascii="Arial" w:hAnsi="Arial" w:cs="Arial"/>
+                <w:noProof/>
+                <w:webHidden/>
+                <w:sz w:val="24"/>
+                <w:szCs w:val="24"/>
+              </w:rPr>
+              <w:t>2</w:t>
+            </w:r>
+            <w:r>
+              <w:rPr>
+                <w:rFonts w:ascii="Arial" w:hAnsi="Arial" w:cs="Arial"/>
+                <w:noProof/>
+                <w:webHidden/>
+                <w:sz w:val="24"/>
+                <w:szCs w:val="24"/>
+              </w:rPr>
+              <w:fldChar w:fldCharType="end"/>
+            </w:r>
+          </w:hyperlink>
+        </w:p>
+        <w:p>
+          <w:pPr>
+            <w:pStyle w:val="TOC2"/>
+            <w:tabs>
+              <w:tab w:val="right" w:leader="dot" w:pos="8630"/>
+            </w:tabs>
+            <w:rPr>
+              <w:rFonts w:ascii="Arial" w:hAnsi="Arial" w:cs="Arial"/>
+              <w:noProof/>
+              <w:sz w:val="24"/>
+              <w:szCs w:val="24"/>
+              <w:lang w:val="pt-BR" w:eastAsia="pt-BR"/>
+            </w:rPr>
+          </w:pPr>
+          <w:hyperlink w:anchor="_Toc214282401" w:history="1">
+            <w:r>
+              <w:rPr>
+                <w:rStyle w:val="Hyperlink"/>
+                <w:rFonts w:ascii="Arial" w:hAnsi="Arial" w:cs="Arial"/>
+                <w:noProof/>
+                <w:sz w:val="24"/>
+                <w:szCs w:val="24"/>
+                <w:lang w:val="pt-BR"/>
+              </w:rPr>
+              <w:t>3. Funcionalidades Principais Implementadas</w:t>
+            </w:r>
+            <w:r>
+              <w:rPr>
+                <w:rFonts w:ascii="Arial" w:hAnsi="Arial" w:cs="Arial"/>
+                <w:noProof/>
+                <w:webHidden/>
+                <w:sz w:val="24"/>
+                <w:szCs w:val="24"/>
+              </w:rPr>
+              <w:tab/>
+            </w:r>
+            <w:r>
+              <w:rPr>
+                <w:rFonts w:ascii="Arial" w:hAnsi="Arial" w:cs="Arial"/>
+                <w:noProof/>
+                <w:webHidden/>
+                <w:sz w:val="24"/>
+                <w:szCs w:val="24"/>
+              </w:rPr>
+              <w:fldChar w:fldCharType="begin"/>
+            </w:r>
+            <w:r>
+              <w:rPr>
+                <w:rFonts w:ascii="Arial" w:hAnsi="Arial" w:cs="Arial"/>
+                <w:noProof/>
+                <w:webHidden/>
+                <w:sz w:val="24"/>
+                <w:szCs w:val="24"/>
+              </w:rPr>
+              <w:instrText xml:space="preserve"> PAGEREF _Toc214282401 \h </w:instrText>
+            </w:r>
+            <w:r>
+              <w:rPr>
+                <w:rFonts w:ascii="Arial" w:hAnsi="Arial" w:cs="Arial"/>
+                <w:noProof/>
+                <w:webHidden/>
+                <w:sz w:val="24"/>
+                <w:szCs w:val="24"/>
+              </w:rPr>
+            </w:r>
+            <w:r>
+              <w:rPr>
+                <w:rFonts w:ascii="Arial" w:hAnsi="Arial" w:cs="Arial"/>
+                <w:noProof/>
+                <w:webHidden/>
+                <w:sz w:val="24"/>
+                <w:szCs w:val="24"/>
+              </w:rPr>
+              <w:fldChar w:fldCharType="separate"/>
+            </w:r>
+            <w:r>
+              <w:rPr>
+                <w:rFonts w:ascii="Arial" w:hAnsi="Arial" w:cs="Arial"/>
+                <w:noProof/>
+                <w:webHidden/>
+                <w:sz w:val="24"/>
+                <w:szCs w:val="24"/>
+              </w:rPr>
+              <w:t>3</w:t>
+            </w:r>
+            <w:r>
+              <w:rPr>
+                <w:rFonts w:ascii="Arial" w:hAnsi="Arial" w:cs="Arial"/>
+                <w:noProof/>
+                <w:webHidden/>
+                <w:sz w:val="24"/>
+                <w:szCs w:val="24"/>
+              </w:rPr>
+              <w:fldChar w:fldCharType="end"/>
+            </w:r>
+          </w:hyperlink>
+        </w:p>
+        <w:p>
+          <w:pPr>
+            <w:pStyle w:val="TOC2"/>
+            <w:tabs>
+              <w:tab w:val="right" w:leader="dot" w:pos="8630"/>
+            </w:tabs>
+            <w:rPr>
+              <w:rFonts w:ascii="Arial" w:hAnsi="Arial" w:cs="Arial"/>
+              <w:noProof/>
+              <w:sz w:val="24"/>
+              <w:szCs w:val="24"/>
+              <w:lang w:val="pt-BR" w:eastAsia="pt-BR"/>
+            </w:rPr>
+          </w:pPr>
+          <w:hyperlink w:anchor="_Toc214282402" w:history="1">
+            <w:r>
+              <w:rPr>
+                <w:rStyle w:val="Hyperlink"/>
+                <w:rFonts w:ascii="Arial" w:hAnsi="Arial" w:cs="Arial"/>
+                <w:noProof/>
+                <w:sz w:val="24"/>
+                <w:szCs w:val="24"/>
+                <w:lang w:val="pt-BR"/>
+              </w:rPr>
+              <w:t>4. Tabela de Endpoints (API RESTful)</w:t>
+            </w:r>
+            <w:r>
+              <w:rPr>
+                <w:rFonts w:ascii="Arial" w:hAnsi="Arial" w:cs="Arial"/>
+                <w:noProof/>
+                <w:webHidden/>
+                <w:sz w:val="24"/>
+                <w:szCs w:val="24"/>
+              </w:rPr>
+              <w:tab/>
+            </w:r>
+            <w:r>
+              <w:rPr>
+                <w:rFonts w:ascii="Arial" w:hAnsi="Arial" w:cs="Arial"/>
+                <w:noProof/>
+                <w:webHidden/>
+                <w:sz w:val="24"/>
+                <w:szCs w:val="24"/>
+              </w:rPr>
+              <w:fldChar w:fldCharType="begin"/>
+            </w:r>
+            <w:r>
+              <w:rPr>
+                <w:rFonts w:ascii="Arial" w:hAnsi="Arial" w:cs="Arial"/>
+                <w:noProof/>
+                <w:webHidden/>
+                <w:sz w:val="24"/>
+                <w:szCs w:val="24"/>
+              </w:rPr>
+              <w:instrText xml:space="preserve"> PAGEREF _Toc214282402 \h </w:instrText>
+            </w:r>
+            <w:r>
+              <w:rPr>
+                <w:rFonts w:ascii="Arial" w:hAnsi="Arial" w:cs="Arial"/>
+                <w:noProof/>
+                <w:webHidden/>
+                <w:sz w:val="24"/>
+                <w:szCs w:val="24"/>
+              </w:rPr>
+            </w:r>
+            <w:r>
+              <w:rPr>
+                <w:rFonts w:ascii="Arial" w:hAnsi="Arial" w:cs="Arial"/>
+                <w:noProof/>
+                <w:webHidden/>
+                <w:sz w:val="24"/>
+                <w:szCs w:val="24"/>
+              </w:rPr>
+              <w:fldChar w:fldCharType="separate"/>
+            </w:r>
+            <w:r>
+              <w:rPr>
+                <w:rFonts w:ascii="Arial" w:hAnsi="Arial" w:cs="Arial"/>
+                <w:noProof/>
+                <w:webHidden/>
+                <w:sz w:val="24"/>
+                <w:szCs w:val="24"/>
+              </w:rPr>
+              <w:t>3</w:t>
+            </w:r>
+            <w:r>
+              <w:rPr>
+                <w:rFonts w:ascii="Arial" w:hAnsi="Arial" w:cs="Arial"/>
+                <w:noProof/>
+                <w:webHidden/>
+                <w:sz w:val="24"/>
+                <w:szCs w:val="24"/>
+              </w:rPr>
+              <w:fldChar w:fldCharType="end"/>
+            </w:r>
+          </w:hyperlink>
+        </w:p>
+        <w:p>
+          <w:pPr>
+            <w:pStyle w:val="TOC2"/>
+            <w:tabs>
+              <w:tab w:val="right" w:leader="dot" w:pos="8630"/>
+            </w:tabs>
+            <w:rPr>
+              <w:rFonts w:ascii="Arial" w:hAnsi="Arial" w:cs="Arial"/>
+              <w:noProof/>
+              <w:sz w:val="24"/>
+              <w:szCs w:val="24"/>
+              <w:lang w:val="pt-BR" w:eastAsia="pt-BR"/>
+            </w:rPr>
+          </w:pPr>
+          <w:hyperlink w:anchor="_Toc214282403" w:history="1">
+            <w:r>
+              <w:rPr>
+                <w:rStyle w:val="Hyperlink"/>
+                <w:rFonts w:ascii="Arial" w:hAnsi="Arial" w:cs="Arial"/>
+                <w:noProof/>
+                <w:sz w:val="24"/>
+                <w:szCs w:val="24"/>
+                <w:lang w:val="pt-BR"/>
+              </w:rPr>
+              <w:t>5. Protótipo – Prints das Telas Implementadas</w:t>
+            </w:r>
+            <w:r>
+              <w:rPr>
+                <w:rFonts w:ascii="Arial" w:hAnsi="Arial" w:cs="Arial"/>
+                <w:noProof/>
+                <w:webHidden/>
+                <w:sz w:val="24"/>
+                <w:szCs w:val="24"/>
+              </w:rPr>
+              <w:tab/>
+            </w:r>
+            <w:r>
+              <w:rPr>
+                <w:rFonts w:ascii="Arial" w:hAnsi="Arial" w:cs="Arial"/>
+                <w:noProof/>
+                <w:webHidden/>
+                <w:sz w:val="24"/>
+                <w:szCs w:val="24"/>
+              </w:rPr>
+              <w:fldChar w:fldCharType="begin"/>
+            </w:r>
+            <w:r>
+              <w:rPr>
+                <w:rFonts w:ascii="Arial" w:hAnsi="Arial" w:cs="Arial"/>
+                <w:noProof/>
+                <w:webHidden/>
+                <w:sz w:val="24"/>
+                <w:szCs w:val="24"/>
+              </w:rPr>
+              <w:instrText xml:space="preserve"> PAGEREF _Toc214282403 \h </w:instrText>
+            </w:r>
+            <w:r>
+              <w:rPr>
+                <w:rFonts w:ascii="Arial" w:hAnsi="Arial" w:cs="Arial"/>
+                <w:noProof/>
+                <w:webHidden/>
+                <w:sz w:val="24"/>
+                <w:szCs w:val="24"/>
+              </w:rPr>
+            </w:r>
+            <w:r>
+              <w:rPr>
+                <w:rFonts w:ascii="Arial" w:hAnsi="Arial" w:cs="Arial"/>
+                <w:noProof/>
+                <w:webHidden/>
+                <w:sz w:val="24"/>
+                <w:szCs w:val="24"/>
+              </w:rPr>
+              <w:fldChar w:fldCharType="separate"/>
+            </w:r>
+            <w:r>
+              <w:rPr>
+                <w:rFonts w:ascii="Arial" w:hAnsi="Arial" w:cs="Arial"/>
+                <w:noProof/>
+                <w:webHidden/>
+                <w:sz w:val="24"/>
+                <w:szCs w:val="24"/>
+              </w:rPr>
+              <w:t>4</w:t>
+            </w:r>
+            <w:r>
+              <w:rPr>
+                <w:rFonts w:ascii="Arial" w:hAnsi="Arial" w:cs="Arial"/>
+                <w:noProof/>
+                <w:webHidden/>
+                <w:sz w:val="24"/>
+                <w:szCs w:val="24"/>
+              </w:rPr>
+              <w:fldChar w:fldCharType="end"/>
+            </w:r>
+          </w:hyperlink>
+        </w:p>
+        <w:p>
+          <w:pPr>
+            <w:pStyle w:val="TOC3"/>
+            <w:tabs>
+              <w:tab w:val="right" w:leader="dot" w:pos="8630"/>
+            </w:tabs>
+            <w:rPr>
+              <w:rFonts w:ascii="Arial" w:hAnsi="Arial" w:cs="Arial"/>
+              <w:noProof/>
+              <w:sz w:val="24"/>
+              <w:szCs w:val="24"/>
+              <w:lang w:val="pt-BR" w:eastAsia="pt-BR"/>
+            </w:rPr>
+          </w:pPr>
+          <w:hyperlink w:anchor="_Toc214282404" w:history="1">
+            <w:r>
+              <w:rPr>
+                <w:rStyle w:val="Hyperlink"/>
+                <w:rFonts w:ascii="Arial" w:hAnsi="Arial" w:cs="Arial"/>
+                <w:noProof/>
+                <w:sz w:val="24"/>
+                <w:szCs w:val="24"/>
+                <w:lang w:val="pt-BR"/>
+              </w:rPr>
+              <w:t>Colaborador:</w:t>
+            </w:r>
+            <w:r>
+              <w:rPr>
+                <w:rFonts w:ascii="Arial" w:hAnsi="Arial" w:cs="Arial"/>
+                <w:noProof/>
+                <w:webHidden/>
+                <w:sz w:val="24"/>
+                <w:szCs w:val="24"/>
+              </w:rPr>
+              <w:tab/>
+            </w:r>
+            <w:r>
+              <w:rPr>
+                <w:rFonts w:ascii="Arial" w:hAnsi="Arial" w:cs="Arial"/>
+                <w:noProof/>
+                <w:webHidden/>
+                <w:sz w:val="24"/>
+                <w:szCs w:val="24"/>
+              </w:rPr>
+              <w:fldChar w:fldCharType="begin"/>
+            </w:r>
+            <w:r>
+              <w:rPr>
+                <w:rFonts w:ascii="Arial" w:hAnsi="Arial" w:cs="Arial"/>
+                <w:noProof/>
+                <w:webHidden/>
+                <w:sz w:val="24"/>
+                <w:szCs w:val="24"/>
+              </w:rPr>
+              <w:instrText xml:space="preserve"> PAGEREF _Toc214282404 \h </w:instrText>
+            </w:r>
+            <w:r>
+              <w:rPr>
+                <w:rFonts w:ascii="Arial" w:hAnsi="Arial" w:cs="Arial"/>
+                <w:noProof/>
+                <w:webHidden/>
+                <w:sz w:val="24"/>
+                <w:szCs w:val="24"/>
+              </w:rPr>
+            </w:r>
+            <w:r>
+              <w:rPr>
+                <w:rFonts w:ascii="Arial" w:hAnsi="Arial" w:cs="Arial"/>
+                <w:noProof/>
+                <w:webHidden/>
+                <w:sz w:val="24"/>
+                <w:szCs w:val="24"/>
+              </w:rPr>
+              <w:fldChar w:fldCharType="separate"/>
+            </w:r>
+            <w:r>
+              <w:rPr>
+                <w:rFonts w:ascii="Arial" w:hAnsi="Arial" w:cs="Arial"/>
+                <w:noProof/>
+                <w:webHidden/>
+                <w:sz w:val="24"/>
+                <w:szCs w:val="24"/>
+              </w:rPr>
+              <w:t>4</w:t>
+            </w:r>
+            <w:r>
+              <w:rPr>
+                <w:rFonts w:ascii="Arial" w:hAnsi="Arial" w:cs="Arial"/>
+                <w:noProof/>
+                <w:webHidden/>
+                <w:sz w:val="24"/>
+                <w:szCs w:val="24"/>
+              </w:rPr>
+              <w:fldChar w:fldCharType="end"/>
+            </w:r>
+          </w:hyperlink>
+        </w:p>
+        <w:p>
+          <w:pPr>
+            <w:pStyle w:val="TOC3"/>
+            <w:tabs>
+              <w:tab w:val="right" w:leader="dot" w:pos="8630"/>
+            </w:tabs>
+            <w:rPr>
+              <w:rFonts w:ascii="Arial" w:hAnsi="Arial" w:cs="Arial"/>
+              <w:noProof/>
+              <w:sz w:val="24"/>
+              <w:szCs w:val="24"/>
+              <w:lang w:val="pt-BR" w:eastAsia="pt-BR"/>
+            </w:rPr>
+          </w:pPr>
+          <w:hyperlink w:anchor="_Toc214282405" w:history="1">
+            <w:r>
+              <w:rPr>
+                <w:rStyle w:val="Hyperlink"/>
+                <w:rFonts w:ascii="Arial" w:hAnsi="Arial" w:cs="Arial"/>
+                <w:noProof/>
+                <w:sz w:val="24"/>
+                <w:szCs w:val="24"/>
+                <w:lang w:val="pt-BR" w:eastAsia="pt-BR"/>
+              </w:rPr>
+              <w:t>Alerta</w:t>
+            </w:r>
+            <w:r>
+              <w:rPr>
+                <w:rStyle w:val="Hyperlink"/>
+                <w:rFonts w:ascii="Arial" w:hAnsi="Arial" w:cs="Arial"/>
+                <w:noProof/>
+                <w:sz w:val="24"/>
+                <w:szCs w:val="24"/>
+                <w:lang w:val="pt-BR" w:eastAsia="pt-BR"/>
+              </w:rPr>
+              <w:t>s</w:t>
+            </w:r>
+            <w:r>
+              <w:rPr>
+                <w:rStyle w:val="Hyperlink"/>
+                <w:rFonts w:ascii="Arial" w:hAnsi="Arial" w:cs="Arial"/>
+                <w:noProof/>
+                <w:sz w:val="24"/>
+                <w:szCs w:val="24"/>
+                <w:lang w:val="pt-BR" w:eastAsia="pt-BR"/>
+              </w:rPr>
+              <w:t>:</w:t>
+            </w:r>
+            <w:r>
+              <w:rPr>
+                <w:rFonts w:ascii="Arial" w:hAnsi="Arial" w:cs="Arial"/>
+                <w:noProof/>
+                <w:webHidden/>
+                <w:sz w:val="24"/>
+                <w:szCs w:val="24"/>
+              </w:rPr>
+              <w:tab/>
+            </w:r>
+            <w:r>
+              <w:rPr>
+                <w:rFonts w:ascii="Arial" w:hAnsi="Arial" w:cs="Arial"/>
+                <w:noProof/>
+                <w:webHidden/>
+                <w:sz w:val="24"/>
+                <w:szCs w:val="24"/>
+              </w:rPr>
+              <w:fldChar w:fldCharType="begin"/>
+            </w:r>
+            <w:r>
+              <w:rPr>
+                <w:rFonts w:ascii="Arial" w:hAnsi="Arial" w:cs="Arial"/>
+                <w:noProof/>
+                <w:webHidden/>
+                <w:sz w:val="24"/>
+                <w:szCs w:val="24"/>
+              </w:rPr>
+              <w:instrText xml:space="preserve"> PAGEREF _Toc214282405 \h </w:instrText>
+            </w:r>
+            <w:r>
+              <w:rPr>
+                <w:rFonts w:ascii="Arial" w:hAnsi="Arial" w:cs="Arial"/>
+                <w:noProof/>
+                <w:webHidden/>
+                <w:sz w:val="24"/>
+                <w:szCs w:val="24"/>
+              </w:rPr>
+            </w:r>
+            <w:r>
+              <w:rPr>
+                <w:rFonts w:ascii="Arial" w:hAnsi="Arial" w:cs="Arial"/>
+                <w:noProof/>
+                <w:webHidden/>
+                <w:sz w:val="24"/>
+                <w:szCs w:val="24"/>
+              </w:rPr>
+              <w:fldChar w:fldCharType="separate"/>
+            </w:r>
+            <w:r>
+              <w:rPr>
+                <w:rFonts w:ascii="Arial" w:hAnsi="Arial" w:cs="Arial"/>
+                <w:noProof/>
+                <w:webHidden/>
+                <w:sz w:val="24"/>
+                <w:szCs w:val="24"/>
+              </w:rPr>
+              <w:t>6</w:t>
+            </w:r>
+            <w:r>
+              <w:rPr>
+                <w:rFonts w:ascii="Arial" w:hAnsi="Arial" w:cs="Arial"/>
+                <w:noProof/>
+                <w:webHidden/>
+                <w:sz w:val="24"/>
+                <w:szCs w:val="24"/>
+              </w:rPr>
+              <w:fldChar w:fldCharType="end"/>
+            </w:r>
+          </w:hyperlink>
+        </w:p>
+        <w:p>
+          <w:pPr>
+            <w:pStyle w:val="TOC2"/>
+            <w:tabs>
+              <w:tab w:val="right" w:leader="dot" w:pos="8630"/>
+            </w:tabs>
+            <w:rPr>
+              <w:rFonts w:ascii="Arial" w:hAnsi="Arial" w:cs="Arial"/>
+              <w:noProof/>
+              <w:sz w:val="24"/>
+              <w:szCs w:val="24"/>
+              <w:lang w:val="pt-BR" w:eastAsia="pt-BR"/>
+            </w:rPr>
+          </w:pPr>
+          <w:hyperlink w:anchor="_Toc214282406" w:history="1">
+            <w:r>
+              <w:rPr>
+                <w:rStyle w:val="Hyperlink"/>
+                <w:rFonts w:ascii="Arial" w:hAnsi="Arial" w:cs="Arial"/>
+                <w:noProof/>
+                <w:sz w:val="24"/>
+                <w:szCs w:val="24"/>
+                <w:lang w:val="pt-BR" w:eastAsia="pt-BR"/>
+              </w:rPr>
+              <w:t>Checkin:</w:t>
+            </w:r>
+            <w:r>
+              <w:rPr>
+                <w:rFonts w:ascii="Arial" w:hAnsi="Arial" w:cs="Arial"/>
+                <w:noProof/>
+                <w:webHidden/>
+                <w:sz w:val="24"/>
+                <w:szCs w:val="24"/>
+              </w:rPr>
+              <w:tab/>
+            </w:r>
+            <w:r>
+              <w:rPr>
+                <w:rFonts w:ascii="Arial" w:hAnsi="Arial" w:cs="Arial"/>
+                <w:noProof/>
+                <w:webHidden/>
+                <w:sz w:val="24"/>
+                <w:szCs w:val="24"/>
+              </w:rPr>
+              <w:fldChar w:fldCharType="begin"/>
+            </w:r>
+            <w:r>
+              <w:rPr>
+                <w:rFonts w:ascii="Arial" w:hAnsi="Arial" w:cs="Arial"/>
+                <w:noProof/>
+                <w:webHidden/>
+                <w:sz w:val="24"/>
+                <w:szCs w:val="24"/>
+              </w:rPr>
+              <w:instrText xml:space="preserve"> PAGEREF _Toc214282406 \h </w:instrText>
+            </w:r>
+            <w:r>
+              <w:rPr>
+                <w:rFonts w:ascii="Arial" w:hAnsi="Arial" w:cs="Arial"/>
+                <w:noProof/>
+                <w:webHidden/>
+                <w:sz w:val="24"/>
+                <w:szCs w:val="24"/>
+              </w:rPr>
+            </w:r>
+            <w:r>
+              <w:rPr>
+                <w:rFonts w:ascii="Arial" w:hAnsi="Arial" w:cs="Arial"/>
+                <w:noProof/>
+                <w:webHidden/>
+                <w:sz w:val="24"/>
+                <w:szCs w:val="24"/>
+              </w:rPr>
+              <w:fldChar w:fldCharType="separate"/>
+            </w:r>
+            <w:r>
+              <w:rPr>
+                <w:rFonts w:ascii="Arial" w:hAnsi="Arial" w:cs="Arial"/>
+                <w:noProof/>
+                <w:webHidden/>
+                <w:sz w:val="24"/>
+                <w:szCs w:val="24"/>
+              </w:rPr>
+              <w:t>7</w:t>
+            </w:r>
+            <w:r>
+              <w:rPr>
+                <w:rFonts w:ascii="Arial" w:hAnsi="Arial" w:cs="Arial"/>
+                <w:noProof/>
+                <w:webHidden/>
+                <w:sz w:val="24"/>
+                <w:szCs w:val="24"/>
+              </w:rPr>
+              <w:fldChar w:fldCharType="end"/>
+            </w:r>
+          </w:hyperlink>
+        </w:p>
+        <w:p>
+          <w:pPr>
+            <w:pStyle w:val="TOC2"/>
+            <w:tabs>
+              <w:tab w:val="right" w:leader="dot" w:pos="8630"/>
+            </w:tabs>
+            <w:rPr>
+              <w:rFonts w:ascii="Arial" w:hAnsi="Arial" w:cs="Arial"/>
+              <w:noProof/>
+              <w:sz w:val="24"/>
+              <w:szCs w:val="24"/>
+              <w:lang w:val="pt-BR" w:eastAsia="pt-BR"/>
+            </w:rPr>
+          </w:pPr>
+          <w:hyperlink w:anchor="_Toc214282407" w:history="1">
+            <w:r>
+              <w:rPr>
+                <w:rStyle w:val="Hyperlink"/>
+                <w:rFonts w:ascii="Arial" w:hAnsi="Arial" w:cs="Arial"/>
+                <w:noProof/>
+                <w:sz w:val="24"/>
+                <w:szCs w:val="24"/>
+                <w:lang w:val="pt-BR" w:eastAsia="pt-BR"/>
+              </w:rPr>
+              <w:t>Rela</w:t>
+            </w:r>
+            <w:r>
+              <w:rPr>
+                <w:rStyle w:val="Hyperlink"/>
+                <w:rFonts w:ascii="Arial" w:hAnsi="Arial" w:cs="Arial"/>
+                <w:noProof/>
+                <w:sz w:val="24"/>
+                <w:szCs w:val="24"/>
+                <w:lang w:val="pt-BR" w:eastAsia="pt-BR"/>
+              </w:rPr>
+              <w:t>t</w:t>
+            </w:r>
+            <w:r>
+              <w:rPr>
+                <w:rStyle w:val="Hyperlink"/>
+                <w:rFonts w:ascii="Arial" w:hAnsi="Arial" w:cs="Arial"/>
+                <w:noProof/>
+                <w:sz w:val="24"/>
+                <w:szCs w:val="24"/>
+                <w:lang w:val="pt-BR" w:eastAsia="pt-BR"/>
+              </w:rPr>
+              <w:t>ó</w:t>
+            </w:r>
+            <w:r>
+              <w:rPr>
+                <w:rStyle w:val="Hyperlink"/>
+                <w:rFonts w:ascii="Arial" w:hAnsi="Arial" w:cs="Arial"/>
+                <w:noProof/>
+                <w:sz w:val="24"/>
+                <w:szCs w:val="24"/>
+                <w:lang w:val="pt-BR" w:eastAsia="pt-BR"/>
+              </w:rPr>
+              <w:t>rio:</w:t>
+            </w:r>
+            <w:r>
+              <w:rPr>
+                <w:rFonts w:ascii="Arial" w:hAnsi="Arial" w:cs="Arial"/>
+                <w:noProof/>
+                <w:webHidden/>
+                <w:sz w:val="24"/>
+                <w:szCs w:val="24"/>
+              </w:rPr>
+              <w:tab/>
+            </w:r>
+            <w:r>
+              <w:rPr>
+                <w:rFonts w:ascii="Arial" w:hAnsi="Arial" w:cs="Arial"/>
+                <w:noProof/>
+                <w:webHidden/>
+                <w:sz w:val="24"/>
+                <w:szCs w:val="24"/>
+              </w:rPr>
+              <w:fldChar w:fldCharType="begin"/>
+            </w:r>
+            <w:r>
+              <w:rPr>
+                <w:rFonts w:ascii="Arial" w:hAnsi="Arial" w:cs="Arial"/>
+                <w:noProof/>
+                <w:webHidden/>
+                <w:sz w:val="24"/>
+                <w:szCs w:val="24"/>
+              </w:rPr>
+              <w:instrText xml:space="preserve"> PAGEREF _Toc214282407 \h </w:instrText>
+            </w:r>
+            <w:r>
+              <w:rPr>
+                <w:rFonts w:ascii="Arial" w:hAnsi="Arial" w:cs="Arial"/>
+                <w:noProof/>
+                <w:webHidden/>
+                <w:sz w:val="24"/>
+                <w:szCs w:val="24"/>
+              </w:rPr>
+            </w:r>
+            <w:r>
+              <w:rPr>
+                <w:rFonts w:ascii="Arial" w:hAnsi="Arial" w:cs="Arial"/>
+                <w:noProof/>
+                <w:webHidden/>
+                <w:sz w:val="24"/>
+                <w:szCs w:val="24"/>
+              </w:rPr>
+              <w:fldChar w:fldCharType="separate"/>
+            </w:r>
+            <w:r>
+              <w:rPr>
+                <w:rFonts w:ascii="Arial" w:hAnsi="Arial" w:cs="Arial"/>
+                <w:noProof/>
+                <w:webHidden/>
+                <w:sz w:val="24"/>
+                <w:szCs w:val="24"/>
+              </w:rPr>
+              <w:t>8</w:t>
+            </w:r>
+            <w:r>
+              <w:rPr>
+                <w:rFonts w:ascii="Arial" w:hAnsi="Arial" w:cs="Arial"/>
+                <w:noProof/>
+                <w:webHidden/>
+                <w:sz w:val="24"/>
+                <w:szCs w:val="24"/>
+              </w:rPr>
+              <w:fldChar w:fldCharType="end"/>
+            </w:r>
+          </w:hyperlink>
+        </w:p>
+        <w:p>
+          <w:pPr>
+            <w:pStyle w:val="TOC2"/>
+            <w:tabs>
+              <w:tab w:val="right" w:leader="dot" w:pos="8630"/>
+            </w:tabs>
+            <w:rPr>
+              <w:rFonts w:ascii="Arial" w:hAnsi="Arial" w:cs="Arial"/>
+              <w:noProof/>
+              <w:sz w:val="24"/>
+              <w:szCs w:val="24"/>
+              <w:lang w:val="pt-BR" w:eastAsia="pt-BR"/>
+            </w:rPr>
+          </w:pPr>
+          <w:hyperlink w:anchor="_Toc214282408" w:history="1">
+            <w:r>
+              <w:rPr>
+                <w:rStyle w:val="Hyperlink"/>
+                <w:rFonts w:ascii="Arial" w:hAnsi="Arial" w:cs="Arial"/>
+                <w:noProof/>
+                <w:sz w:val="24"/>
+                <w:szCs w:val="24"/>
+                <w:lang w:val="pt-BR"/>
+              </w:rPr>
+              <w:t>6. Modelo de Entidade-Relacionamento (MER)</w:t>
+            </w:r>
+            <w:r>
+              <w:rPr>
+                <w:rFonts w:ascii="Arial" w:hAnsi="Arial" w:cs="Arial"/>
+                <w:noProof/>
+                <w:webHidden/>
+                <w:sz w:val="24"/>
+                <w:szCs w:val="24"/>
+              </w:rPr>
+              <w:tab/>
+            </w:r>
+            <w:r>
+              <w:rPr>
+                <w:rFonts w:ascii="Arial" w:hAnsi="Arial" w:cs="Arial"/>
+                <w:noProof/>
+                <w:webHidden/>
+                <w:sz w:val="24"/>
+                <w:szCs w:val="24"/>
+              </w:rPr>
+              <w:fldChar w:fldCharType="begin"/>
+            </w:r>
+            <w:r>
+              <w:rPr>
+                <w:rFonts w:ascii="Arial" w:hAnsi="Arial" w:cs="Arial"/>
+                <w:noProof/>
+                <w:webHidden/>
+                <w:sz w:val="24"/>
+                <w:szCs w:val="24"/>
+              </w:rPr>
+              <w:instrText xml:space="preserve"> PAGEREF _Toc214282408 \h </w:instrText>
+            </w:r>
+            <w:r>
+              <w:rPr>
+                <w:rFonts w:ascii="Arial" w:hAnsi="Arial" w:cs="Arial"/>
+                <w:noProof/>
+                <w:webHidden/>
+                <w:sz w:val="24"/>
+                <w:szCs w:val="24"/>
+              </w:rPr>
+            </w:r>
+            <w:r>
+              <w:rPr>
+                <w:rFonts w:ascii="Arial" w:hAnsi="Arial" w:cs="Arial"/>
+                <w:noProof/>
+                <w:webHidden/>
+                <w:sz w:val="24"/>
+                <w:szCs w:val="24"/>
+              </w:rPr>
+              <w:fldChar w:fldCharType="separate"/>
+            </w:r>
+            <w:r>
+              <w:rPr>
+                <w:rFonts w:ascii="Arial" w:hAnsi="Arial" w:cs="Arial"/>
+                <w:noProof/>
+                <w:webHidden/>
+                <w:sz w:val="24"/>
+                <w:szCs w:val="24"/>
+              </w:rPr>
+              <w:t>10</w:t>
+            </w:r>
+            <w:r>
+              <w:rPr>
+                <w:rFonts w:ascii="Arial" w:hAnsi="Arial" w:cs="Arial"/>
+                <w:noProof/>
+                <w:webHidden/>
+                <w:sz w:val="24"/>
+                <w:szCs w:val="24"/>
+              </w:rPr>
+              <w:fldChar w:fldCharType="end"/>
+            </w:r>
+          </w:hyperlink>
+        </w:p>
+        <w:p>
+          <w:pPr>
+            <w:pStyle w:val="TOC2"/>
+            <w:tabs>
+              <w:tab w:val="right" w:leader="dot" w:pos="8630"/>
+            </w:tabs>
+            <w:rPr>
+              <w:rFonts w:ascii="Arial" w:hAnsi="Arial" w:cs="Arial"/>
+              <w:noProof/>
+              <w:sz w:val="24"/>
+              <w:szCs w:val="24"/>
+              <w:lang w:val="pt-BR" w:eastAsia="pt-BR"/>
+            </w:rPr>
+          </w:pPr>
+          <w:hyperlink w:anchor="_Toc214282409" w:history="1">
+            <w:r>
+              <w:rPr>
+                <w:rStyle w:val="Hyperlink"/>
+                <w:rFonts w:ascii="Arial" w:hAnsi="Arial" w:cs="Arial"/>
+                <w:noProof/>
+                <w:sz w:val="24"/>
+                <w:szCs w:val="24"/>
+                <w:lang w:val="pt-BR"/>
+              </w:rPr>
+              <w:t>7. Diagrama de Cla</w:t>
+            </w:r>
+            <w:r>
+              <w:rPr>
+                <w:rStyle w:val="Hyperlink"/>
+                <w:rFonts w:ascii="Arial" w:hAnsi="Arial" w:cs="Arial"/>
+                <w:noProof/>
+                <w:sz w:val="24"/>
+                <w:szCs w:val="24"/>
+                <w:lang w:val="pt-BR"/>
+              </w:rPr>
+              <w:t>s</w:t>
+            </w:r>
+            <w:r>
+              <w:rPr>
+                <w:rStyle w:val="Hyperlink"/>
+                <w:rFonts w:ascii="Arial" w:hAnsi="Arial" w:cs="Arial"/>
+                <w:noProof/>
+                <w:sz w:val="24"/>
+                <w:szCs w:val="24"/>
+                <w:lang w:val="pt-BR"/>
+              </w:rPr>
+              <w:t>se</w:t>
+            </w:r>
+            <w:r>
+              <w:rPr>
+                <w:rStyle w:val="Hyperlink"/>
+                <w:rFonts w:ascii="Arial" w:hAnsi="Arial" w:cs="Arial"/>
+                <w:noProof/>
+                <w:sz w:val="24"/>
+                <w:szCs w:val="24"/>
+                <w:lang w:val="pt-BR"/>
+              </w:rPr>
+              <w:t>s</w:t>
+            </w:r>
+            <w:r>
+              <w:rPr>
+                <w:rFonts w:ascii="Arial" w:hAnsi="Arial" w:cs="Arial"/>
+                <w:noProof/>
+                <w:webHidden/>
+                <w:sz w:val="24"/>
+                <w:szCs w:val="24"/>
+              </w:rPr>
+              <w:tab/>
+            </w:r>
+            <w:r>
+              <w:rPr>
+                <w:rFonts w:ascii="Arial" w:hAnsi="Arial" w:cs="Arial"/>
+                <w:noProof/>
+                <w:webHidden/>
+                <w:sz w:val="24"/>
+                <w:szCs w:val="24"/>
+              </w:rPr>
+              <w:fldChar w:fldCharType="begin"/>
+            </w:r>
+            <w:r>
+              <w:rPr>
+                <w:rFonts w:ascii="Arial" w:hAnsi="Arial" w:cs="Arial"/>
+                <w:noProof/>
+                <w:webHidden/>
+                <w:sz w:val="24"/>
+                <w:szCs w:val="24"/>
+              </w:rPr>
+              <w:instrText xml:space="preserve"> PAGEREF _Toc214282409 \h </w:instrText>
+            </w:r>
+            <w:r>
+              <w:rPr>
+                <w:rFonts w:ascii="Arial" w:hAnsi="Arial" w:cs="Arial"/>
+                <w:noProof/>
+                <w:webHidden/>
+                <w:sz w:val="24"/>
+                <w:szCs w:val="24"/>
+              </w:rPr>
+            </w:r>
+            <w:r>
+              <w:rPr>
+                <w:rFonts w:ascii="Arial" w:hAnsi="Arial" w:cs="Arial"/>
+                <w:noProof/>
+                <w:webHidden/>
+                <w:sz w:val="24"/>
+                <w:szCs w:val="24"/>
+              </w:rPr>
+              <w:fldChar w:fldCharType="separate"/>
+            </w:r>
+            <w:r>
+              <w:rPr>
+                <w:rFonts w:ascii="Arial" w:hAnsi="Arial" w:cs="Arial"/>
+                <w:noProof/>
+                <w:webHidden/>
+                <w:sz w:val="24"/>
+                <w:szCs w:val="24"/>
+              </w:rPr>
+              <w:t>11</w:t>
+            </w:r>
+            <w:r>
+              <w:rPr>
+                <w:rFonts w:ascii="Arial" w:hAnsi="Arial" w:cs="Arial"/>
+                <w:noProof/>
+                <w:webHidden/>
+                <w:sz w:val="24"/>
+                <w:szCs w:val="24"/>
+              </w:rPr>
+              <w:fldChar w:fldCharType="end"/>
+            </w:r>
+          </w:hyperlink>
+        </w:p>
+        <w:p>
+          <w:r>
+            <w:rPr>
+              <w:rFonts w:ascii="Arial" w:hAnsi="Arial" w:cs="Arial"/>
+              <w:b/>
+              <w:bCs/>
+              <w:sz w:val="24"/>
+              <w:szCs w:val="24"/>
+            </w:rPr>
+            <w:fldChar w:fldCharType="end"/>
+          </w:r>
+        </w:p>
+      </w:sdtContent>
+    </w:sdt>
     <w:p>
       <w:pPr>
         <w:rPr>
@@ -388,6 +1916,7 @@
           <w:lang w:val="pt-BR"/>
         </w:rPr>
       </w:pPr>
+      <w:bookmarkStart w:id="4" w:name="_Toc214282398"/>
       <w:r>
         <w:rPr>
           <w:rFonts w:ascii="Arial" w:hAnsi="Arial" w:cs="Arial"/>
@@ -397,6 +1926,7 @@
         </w:rPr>
         <w:t>Link do vídeo:</w:t>
       </w:r>
+      <w:bookmarkEnd w:id="4"/>
     </w:p>
     <w:p>
       <w:pPr>
@@ -415,6 +1945,7 @@
           <w:lang w:val="pt-BR"/>
         </w:rPr>
       </w:pPr>
+      <w:bookmarkStart w:id="5" w:name="_Toc214282399"/>
       <w:r>
         <w:rPr>
           <w:rFonts w:ascii="Arial" w:hAnsi="Arial" w:cs="Arial"/>
@@ -422,9 +1953,9 @@
           <w:szCs w:val="28"/>
           <w:lang w:val="pt-BR"/>
         </w:rPr>
-        <w:lastRenderedPageBreak/>
         <w:t>1. Objetivo e Escopo do Projeto</w:t>
       </w:r>
+      <w:bookmarkEnd w:id="5"/>
     </w:p>
     <w:p>
       <w:pPr>
@@ -439,7 +1970,6 @@
         </w:rPr>
         <w:t xml:space="preserve">O projeto </w:t>
       </w:r>
-      <w:proofErr w:type="spellStart"/>
       <w:r>
         <w:rPr>
           <w:rStyle w:val="Strong"/>
@@ -447,7 +1977,6 @@
         </w:rPr>
         <w:t>MindTrack</w:t>
       </w:r>
-      <w:proofErr w:type="spellEnd"/>
       <w:r>
         <w:rPr>
           <w:rFonts w:ascii="Arial" w:hAnsi="Arial" w:cs="Arial"/>
@@ -492,21 +2021,7 @@
         <w:rPr>
           <w:rFonts w:ascii="Arial" w:hAnsi="Arial" w:cs="Arial"/>
         </w:rPr>
-        <w:t xml:space="preserve">, permitindo que colaboradores registrem seu humor diariamente, enquanto o sistema gera relatórios inteligentes e identifica padrões de risco que possam demandar atenção imediata. Dessa forma, o </w:t>
-      </w:r>
-      <w:proofErr w:type="spellStart"/>
-      <w:r>
-        <w:rPr>
-          <w:rFonts w:ascii="Arial" w:hAnsi="Arial" w:cs="Arial"/>
-        </w:rPr>
-        <w:t>MindTrack</w:t>
-      </w:r>
-      <w:proofErr w:type="spellEnd"/>
-      <w:r>
-        <w:rPr>
-          <w:rFonts w:ascii="Arial" w:hAnsi="Arial" w:cs="Arial"/>
-        </w:rPr>
-        <w:t xml:space="preserve"> atua como uma ferramenta de apoio à tomada de decisão, fornecendo dados reais e atualizados sobre o bem-estar das equipes.</w:t>
+        <w:t>, permitindo que colaboradores registrem seu humor diariamente, enquanto o sistema gera relatórios inteligentes e identifica padrões de risco que possam demandar atenção imediata. Dessa forma, o MindTrack atua como uma ferramenta de apoio à tomada de decisão, fornecendo dados reais e atualizados sobre o bem-estar das equipes.</w:t>
       </w:r>
     </w:p>
     <w:p>
@@ -524,43 +2039,13 @@
           <w:rStyle w:val="Strong"/>
           <w:rFonts w:ascii="Arial" w:hAnsi="Arial" w:cs="Arial"/>
         </w:rPr>
-        <w:t xml:space="preserve">Domain </w:t>
-      </w:r>
-      <w:proofErr w:type="spellStart"/>
-      <w:r>
-        <w:rPr>
-          <w:rStyle w:val="Strong"/>
-          <w:rFonts w:ascii="Arial" w:hAnsi="Arial" w:cs="Arial"/>
-        </w:rPr>
-        <w:t>Driven</w:t>
-      </w:r>
-      <w:proofErr w:type="spellEnd"/>
-      <w:r>
-        <w:rPr>
-          <w:rStyle w:val="Strong"/>
-          <w:rFonts w:ascii="Arial" w:hAnsi="Arial" w:cs="Arial"/>
-        </w:rPr>
-        <w:t xml:space="preserve"> Design (DDD)</w:t>
+        <w:t>Domain Driven Design (DDD)</w:t>
       </w:r>
       <w:r>
         <w:rPr>
           <w:rFonts w:ascii="Arial" w:hAnsi="Arial" w:cs="Arial"/>
         </w:rPr>
-        <w:t xml:space="preserve"> para garantir organização modular, clara separação de responsabilidades e facilidade de manutenção. Cada componente da aplicação (Model, DAO, BO e </w:t>
-      </w:r>
-      <w:proofErr w:type="spellStart"/>
-      <w:r>
-        <w:rPr>
-          <w:rFonts w:ascii="Arial" w:hAnsi="Arial" w:cs="Arial"/>
-        </w:rPr>
-        <w:t>Resource</w:t>
-      </w:r>
-      <w:proofErr w:type="spellEnd"/>
-      <w:r>
-        <w:rPr>
-          <w:rFonts w:ascii="Arial" w:hAnsi="Arial" w:cs="Arial"/>
-        </w:rPr>
-        <w:t>) foi projetado de forma independente, garantindo escalabilidade futura e permitindo que novas funcionalidades sejam integradas sem comprometer a estrutura existente</w:t>
+        <w:t xml:space="preserve"> para garantir organização modular, clara separação de responsabilidades e facilidade de manutenção. Cada componente da aplicação (Model, DAO, BO e Resource) foi projetado de forma independente, garantindo escalabilidade futura e permitindo que novas funcionalidades sejam integradas sem comprometer a estrutura existente</w:t>
       </w:r>
       <w:r>
         <w:t>.</w:t>
@@ -578,6 +2063,7 @@
           <w:lang w:val="pt-BR"/>
         </w:rPr>
       </w:pPr>
+      <w:bookmarkStart w:id="6" w:name="_Toc214282400"/>
       <w:r>
         <w:rPr>
           <w:rStyle w:val="Strong"/>
@@ -596,6 +2082,7 @@
         </w:rPr>
         <w:t>. Breve Descrição das Principais Funcionalidades da Solução</w:t>
       </w:r>
+      <w:bookmarkEnd w:id="6"/>
     </w:p>
     <w:p>
       <w:pPr>
@@ -610,7 +2097,6 @@
         </w:rPr>
         <w:t xml:space="preserve">A solução </w:t>
       </w:r>
-      <w:proofErr w:type="spellStart"/>
       <w:r>
         <w:rPr>
           <w:rStyle w:val="Strong"/>
@@ -618,7 +2104,6 @@
         </w:rPr>
         <w:t>MindTrack</w:t>
       </w:r>
-      <w:proofErr w:type="spellEnd"/>
       <w:r>
         <w:rPr>
           <w:rFonts w:ascii="Arial" w:hAnsi="Arial" w:cs="Arial"/>
@@ -646,6 +2131,7 @@
         <w:rPr>
           <w:rFonts w:ascii="Arial" w:hAnsi="Arial" w:cs="Arial"/>
         </w:rPr>
+        <w:lastRenderedPageBreak/>
         <w:t>O sistema possibilita que cada colaborador registre seu humor diariamente, adicionando comentários opcionais. Esses registros são utilizados pela plataforma para gerar relatórios que consolidam tendências emocionais, médias de humor e comportamentos recorrentes ao longo do tempo. Quando padrões críticos são detectados — como humor baixo frequente, estresse prolongado ou ausência de variação emocional — o sistema dispara alertas automáticos que auxiliam líderes e equipes de RH a intervirem de forma rápida e apropriada.</w:t>
       </w:r>
     </w:p>
@@ -704,7 +2190,6 @@
           <w:rStyle w:val="Strong"/>
           <w:rFonts w:ascii="Arial" w:hAnsi="Arial" w:cs="Arial"/>
         </w:rPr>
-        <w:lastRenderedPageBreak/>
         <w:t>Registro de Check-ins de Humor:</w:t>
       </w:r>
       <w:r>
@@ -796,6 +2281,7 @@
           <w:lang w:val="pt-BR"/>
         </w:rPr>
       </w:pPr>
+      <w:bookmarkStart w:id="7" w:name="_Toc214282401"/>
       <w:r>
         <w:rPr>
           <w:rFonts w:ascii="Arial" w:hAnsi="Arial" w:cs="Arial"/>
@@ -805,6 +2291,7 @@
         </w:rPr>
         <w:t>3. Funcionalidades Principais Implementadas</w:t>
       </w:r>
+      <w:bookmarkEnd w:id="7"/>
     </w:p>
     <w:p>
       <w:pPr>
@@ -822,16 +2309,7 @@
           <w:szCs w:val="24"/>
           <w:lang w:val="pt-BR"/>
         </w:rPr>
-        <w:t>- Cadastr</w:t>
-      </w:r>
-      <w:r>
-        <w:rPr>
-          <w:rFonts w:ascii="Arial" w:hAnsi="Arial" w:cs="Arial"/>
-          <w:sz w:val="24"/>
-          <w:szCs w:val="24"/>
-          <w:lang w:val="pt-BR"/>
-        </w:rPr>
-        <w:t>o de colaboradores</w:t>
+        <w:t>- Cadastro de colaboradores</w:t>
       </w:r>
       <w:r>
         <w:rPr>
@@ -881,19 +2359,8 @@
           <w:lang w:val="pt-BR"/>
         </w:rPr>
         <w:br/>
-        <w:t xml:space="preserve">- API REST testada no </w:t>
+        <w:t>- API REST testada no Postman</w:t>
       </w:r>
-      <w:proofErr w:type="spellStart"/>
-      <w:r>
-        <w:rPr>
-          <w:rFonts w:ascii="Arial" w:hAnsi="Arial" w:cs="Arial"/>
-          <w:sz w:val="24"/>
-          <w:szCs w:val="24"/>
-          <w:lang w:val="pt-BR"/>
-        </w:rPr>
-        <w:t>Postman</w:t>
-      </w:r>
-      <w:proofErr w:type="spellEnd"/>
     </w:p>
     <w:p>
       <w:pPr>
@@ -912,40 +2379,14 @@
           <w:lang w:val="pt-BR"/>
         </w:rPr>
       </w:pPr>
+      <w:bookmarkStart w:id="8" w:name="_Toc214282402"/>
       <w:r>
         <w:rPr>
           <w:lang w:val="pt-BR"/>
         </w:rPr>
-        <w:t xml:space="preserve">4. Tabela de </w:t>
+        <w:t>4. Tabela de Endpoints (API RESTful)</w:t>
       </w:r>
-      <w:proofErr w:type="spellStart"/>
-      <w:r>
-        <w:rPr>
-          <w:lang w:val="pt-BR"/>
-        </w:rPr>
-        <w:t>Endpoints</w:t>
-      </w:r>
-      <w:proofErr w:type="spellEnd"/>
-      <w:r>
-        <w:rPr>
-          <w:lang w:val="pt-BR"/>
-        </w:rPr>
-        <w:t xml:space="preserve"> (API </w:t>
-      </w:r>
-      <w:proofErr w:type="spellStart"/>
-      <w:r>
-        <w:rPr>
-          <w:lang w:val="pt-BR"/>
-        </w:rPr>
-        <w:t>RESTful</w:t>
-      </w:r>
-      <w:proofErr w:type="spellEnd"/>
-      <w:r>
-        <w:rPr>
-          <w:lang w:val="pt-BR"/>
-        </w:rPr>
-        <w:t>)</w:t>
-      </w:r>
+      <w:bookmarkEnd w:id="8"/>
     </w:p>
     <w:tbl>
       <w:tblPr>
@@ -972,11 +2413,9 @@
             <w:tcW w:w="2160" w:type="dxa"/>
           </w:tcPr>
           <w:p>
-            <w:proofErr w:type="spellStart"/>
             <w:r>
               <w:t>Recurso</w:t>
             </w:r>
-            <w:proofErr w:type="spellEnd"/>
           </w:p>
         </w:tc>
         <w:tc>
@@ -1101,6 +2540,7 @@
           </w:tcPr>
           <w:p>
             <w:r>
+              <w:lastRenderedPageBreak/>
               <w:t>Checkin</w:t>
             </w:r>
           </w:p>
@@ -1357,6 +2797,7 @@
           <w:lang w:val="pt-BR"/>
         </w:rPr>
       </w:pPr>
+      <w:bookmarkStart w:id="9" w:name="_Toc214282403"/>
       <w:r>
         <w:rPr>
           <w:rFonts w:ascii="Arial" w:hAnsi="Arial" w:cs="Arial"/>
@@ -1366,6 +2807,7 @@
         </w:rPr>
         <w:t>5. Protótipo – Prints das Telas Implementadas</w:t>
       </w:r>
+      <w:bookmarkEnd w:id="9"/>
     </w:p>
     <w:p>
       <w:pPr>
@@ -1373,20 +2815,28 @@
           <w:lang w:val="pt-BR"/>
         </w:rPr>
       </w:pPr>
-      <w:proofErr w:type="spellStart"/>
       <w:r>
         <w:rPr>
           <w:lang w:val="pt-BR"/>
         </w:rPr>
-        <w:t>PostMan</w:t>
+        <w:t>PostMan:</w:t>
       </w:r>
-      <w:proofErr w:type="spellEnd"/>
+    </w:p>
+    <w:p>
+      <w:pPr>
+        <w:pStyle w:val="Heading3"/>
+        <w:rPr>
+          <w:lang w:val="pt-BR"/>
+        </w:rPr>
+      </w:pPr>
+      <w:bookmarkStart w:id="10" w:name="_Toc214282404"/>
       <w:r>
         <w:rPr>
           <w:lang w:val="pt-BR"/>
         </w:rPr>
-        <w:t>:</w:t>
+        <w:t>Colaborador:</w:t>
       </w:r>
+      <w:bookmarkEnd w:id="10"/>
     </w:p>
     <w:p>
       <w:pPr>
@@ -1401,16 +2851,14 @@
       <w:r>
         <w:rPr>
           <w:rFonts w:ascii="Times New Roman" w:eastAsia="Times New Roman" w:hAnsi="Times New Roman" w:cs="Times New Roman"/>
-          <w:noProof/>
           <w:sz w:val="24"/>
           <w:szCs w:val="24"/>
           <w:lang w:val="pt-BR" w:eastAsia="pt-BR"/>
         </w:rPr>
-        <w:lastRenderedPageBreak/>
         <w:drawing>
-          <wp:inline distT="0" distB="0" distL="0" distR="0" wp14:anchorId="76A88686" wp14:editId="63F7F9CA">
-            <wp:extent cx="5486400" cy="3826510"/>
-            <wp:effectExtent l="0" t="0" r="0" b="2540"/>
+          <wp:inline distT="0" distB="0" distL="0" distR="0" wp14:anchorId="44EEB1B1" wp14:editId="46AC2783">
+            <wp:extent cx="4667250" cy="2632891"/>
+            <wp:effectExtent l="0" t="0" r="0" b="0"/>
             <wp:docPr id="1" name="Picture 1"/>
             <wp:cNvGraphicFramePr>
               <a:graphicFrameLocks xmlns:a="http://schemas.openxmlformats.org/drawingml/2006/main" noChangeAspect="1"/>
@@ -1419,36 +2867,154 @@
               <a:graphicData uri="http://schemas.openxmlformats.org/drawingml/2006/picture">
                 <pic:pic xmlns:pic="http://schemas.openxmlformats.org/drawingml/2006/picture">
                   <pic:nvPicPr>
-                    <pic:cNvPr id="0" name="Picture 1"/>
-                    <pic:cNvPicPr>
-                      <a:picLocks noChangeAspect="1" noChangeArrowheads="1"/>
-                    </pic:cNvPicPr>
+                    <pic:cNvPr id="1" name=""/>
+                    <pic:cNvPicPr/>
                   </pic:nvPicPr>
                   <pic:blipFill>
-                    <a:blip r:embed="rId6">
-                      <a:extLst>
-                        <a:ext uri="{28A0092B-C50C-407E-A947-70E740481C1C}">
-                          <a14:useLocalDpi xmlns:a14="http://schemas.microsoft.com/office/drawing/2010/main" val="0"/>
-                        </a:ext>
-                      </a:extLst>
-                    </a:blip>
-                    <a:srcRect/>
+                    <a:blip r:embed="rId6"/>
                     <a:stretch>
                       <a:fillRect/>
                     </a:stretch>
                   </pic:blipFill>
-                  <pic:spPr bwMode="auto">
+                  <pic:spPr>
                     <a:xfrm>
                       <a:off x="0" y="0"/>
-                      <a:ext cx="5486400" cy="3826510"/>
+                      <a:ext cx="4675073" cy="2637304"/>
                     </a:xfrm>
                     <a:prstGeom prst="rect">
                       <a:avLst/>
                     </a:prstGeom>
-                    <a:noFill/>
-                    <a:ln>
-                      <a:noFill/>
-                    </a:ln>
+                  </pic:spPr>
+                </pic:pic>
+              </a:graphicData>
+            </a:graphic>
+          </wp:inline>
+        </w:drawing>
+      </w:r>
+    </w:p>
+    <w:p>
+      <w:pPr>
+        <w:spacing w:before="100" w:beforeAutospacing="1" w:after="100" w:afterAutospacing="1" w:line="240" w:lineRule="auto"/>
+        <w:rPr>
+          <w:rFonts w:ascii="Times New Roman" w:eastAsia="Times New Roman" w:hAnsi="Times New Roman" w:cs="Times New Roman"/>
+          <w:sz w:val="24"/>
+          <w:szCs w:val="24"/>
+          <w:lang w:val="pt-BR" w:eastAsia="pt-BR"/>
+        </w:rPr>
+      </w:pPr>
+    </w:p>
+    <w:p>
+      <w:pPr>
+        <w:spacing w:before="100" w:beforeAutospacing="1" w:after="100" w:afterAutospacing="1" w:line="240" w:lineRule="auto"/>
+        <w:rPr>
+          <w:rFonts w:ascii="Times New Roman" w:eastAsia="Times New Roman" w:hAnsi="Times New Roman" w:cs="Times New Roman"/>
+          <w:sz w:val="24"/>
+          <w:szCs w:val="24"/>
+          <w:lang w:val="pt-BR" w:eastAsia="pt-BR"/>
+        </w:rPr>
+      </w:pPr>
+      <w:r>
+        <w:rPr>
+          <w:rFonts w:ascii="Times New Roman" w:eastAsia="Times New Roman" w:hAnsi="Times New Roman" w:cs="Times New Roman"/>
+          <w:sz w:val="24"/>
+          <w:szCs w:val="24"/>
+          <w:lang w:val="pt-BR" w:eastAsia="pt-BR"/>
+        </w:rPr>
+        <w:lastRenderedPageBreak/>
+        <w:drawing>
+          <wp:inline distT="0" distB="0" distL="0" distR="0" wp14:anchorId="328BC067" wp14:editId="5EC2FC5F">
+            <wp:extent cx="4667250" cy="2138616"/>
+            <wp:effectExtent l="0" t="0" r="0" b="0"/>
+            <wp:docPr id="5" name="Picture 5"/>
+            <wp:cNvGraphicFramePr>
+              <a:graphicFrameLocks xmlns:a="http://schemas.openxmlformats.org/drawingml/2006/main" noChangeAspect="1"/>
+            </wp:cNvGraphicFramePr>
+            <a:graphic xmlns:a="http://schemas.openxmlformats.org/drawingml/2006/main">
+              <a:graphicData uri="http://schemas.openxmlformats.org/drawingml/2006/picture">
+                <pic:pic xmlns:pic="http://schemas.openxmlformats.org/drawingml/2006/picture">
+                  <pic:nvPicPr>
+                    <pic:cNvPr id="1" name=""/>
+                    <pic:cNvPicPr/>
+                  </pic:nvPicPr>
+                  <pic:blipFill>
+                    <a:blip r:embed="rId7"/>
+                    <a:stretch>
+                      <a:fillRect/>
+                    </a:stretch>
+                  </pic:blipFill>
+                  <pic:spPr>
+                    <a:xfrm>
+                      <a:off x="0" y="0"/>
+                      <a:ext cx="4673576" cy="2141515"/>
+                    </a:xfrm>
+                    <a:prstGeom prst="rect">
+                      <a:avLst/>
+                    </a:prstGeom>
+                  </pic:spPr>
+                </pic:pic>
+              </a:graphicData>
+            </a:graphic>
+          </wp:inline>
+        </w:drawing>
+      </w:r>
+    </w:p>
+    <w:p>
+      <w:pPr>
+        <w:spacing w:before="100" w:beforeAutospacing="1" w:after="100" w:afterAutospacing="1" w:line="240" w:lineRule="auto"/>
+        <w:rPr>
+          <w:rFonts w:ascii="Times New Roman" w:eastAsia="Times New Roman" w:hAnsi="Times New Roman" w:cs="Times New Roman"/>
+          <w:sz w:val="24"/>
+          <w:szCs w:val="24"/>
+          <w:lang w:val="pt-BR" w:eastAsia="pt-BR"/>
+        </w:rPr>
+      </w:pPr>
+    </w:p>
+    <w:p>
+      <w:pPr>
+        <w:spacing w:before="100" w:beforeAutospacing="1" w:after="100" w:afterAutospacing="1" w:line="240" w:lineRule="auto"/>
+        <w:rPr>
+          <w:rFonts w:ascii="Times New Roman" w:eastAsia="Times New Roman" w:hAnsi="Times New Roman" w:cs="Times New Roman"/>
+          <w:sz w:val="24"/>
+          <w:szCs w:val="24"/>
+          <w:lang w:val="pt-BR" w:eastAsia="pt-BR"/>
+        </w:rPr>
+      </w:pPr>
+      <w:r>
+        <w:rPr>
+          <w:rFonts w:ascii="Times New Roman" w:eastAsia="Times New Roman" w:hAnsi="Times New Roman" w:cs="Times New Roman"/>
+          <w:sz w:val="24"/>
+          <w:szCs w:val="24"/>
+          <w:lang w:val="pt-BR" w:eastAsia="pt-BR"/>
+        </w:rPr>
+        <w:drawing>
+          <wp:inline distT="0" distB="0" distL="0" distR="0" wp14:anchorId="30351B7B" wp14:editId="59FEE0E1">
+            <wp:extent cx="4712988" cy="1981200"/>
+            <wp:effectExtent l="0" t="0" r="0" b="0"/>
+            <wp:docPr id="6" name="Picture 6"/>
+            <wp:cNvGraphicFramePr>
+              <a:graphicFrameLocks xmlns:a="http://schemas.openxmlformats.org/drawingml/2006/main" noChangeAspect="1"/>
+            </wp:cNvGraphicFramePr>
+            <a:graphic xmlns:a="http://schemas.openxmlformats.org/drawingml/2006/main">
+              <a:graphicData uri="http://schemas.openxmlformats.org/drawingml/2006/picture">
+                <pic:pic xmlns:pic="http://schemas.openxmlformats.org/drawingml/2006/picture">
+                  <pic:nvPicPr>
+                    <pic:cNvPr id="1" name=""/>
+                    <pic:cNvPicPr/>
+                  </pic:nvPicPr>
+                  <pic:blipFill>
+                    <a:blip r:embed="rId8"/>
+                    <a:stretch>
+                      <a:fillRect/>
+                    </a:stretch>
+                  </pic:blipFill>
+                  <pic:spPr>
+                    <a:xfrm>
+                      <a:off x="0" y="0"/>
+                      <a:ext cx="4730477" cy="1988552"/>
+                    </a:xfrm>
+                    <a:prstGeom prst="rect">
+                      <a:avLst/>
+                    </a:prstGeom>
                   </pic:spPr>
                 </pic:pic>
               </a:graphicData>
@@ -1470,16 +3036,15 @@
       <w:r>
         <w:rPr>
           <w:rFonts w:ascii="Times New Roman" w:eastAsia="Times New Roman" w:hAnsi="Times New Roman" w:cs="Times New Roman"/>
-          <w:noProof/>
           <w:sz w:val="24"/>
           <w:szCs w:val="24"/>
           <w:lang w:val="pt-BR" w:eastAsia="pt-BR"/>
         </w:rPr>
         <w:drawing>
-          <wp:inline distT="0" distB="0" distL="0" distR="0" wp14:anchorId="5B000224" wp14:editId="00C7F89F">
-            <wp:extent cx="5486400" cy="3768090"/>
-            <wp:effectExtent l="0" t="0" r="0" b="3810"/>
-            <wp:docPr id="2" name="Picture 2"/>
+          <wp:inline distT="0" distB="0" distL="0" distR="0" wp14:anchorId="1328F3D6" wp14:editId="2D145E3C">
+            <wp:extent cx="4734838" cy="2000250"/>
+            <wp:effectExtent l="0" t="0" r="8890" b="0"/>
+            <wp:docPr id="7" name="Picture 7"/>
             <wp:cNvGraphicFramePr>
               <a:graphicFrameLocks xmlns:a="http://schemas.openxmlformats.org/drawingml/2006/main" noChangeAspect="1"/>
             </wp:cNvGraphicFramePr>
@@ -1487,36 +3052,117 @@
               <a:graphicData uri="http://schemas.openxmlformats.org/drawingml/2006/picture">
                 <pic:pic xmlns:pic="http://schemas.openxmlformats.org/drawingml/2006/picture">
                   <pic:nvPicPr>
-                    <pic:cNvPr id="0" name="Picture 3"/>
-                    <pic:cNvPicPr>
-                      <a:picLocks noChangeAspect="1" noChangeArrowheads="1"/>
-                    </pic:cNvPicPr>
+                    <pic:cNvPr id="1" name=""/>
+                    <pic:cNvPicPr/>
                   </pic:nvPicPr>
                   <pic:blipFill>
-                    <a:blip r:embed="rId7">
-                      <a:extLst>
-                        <a:ext uri="{28A0092B-C50C-407E-A947-70E740481C1C}">
-                          <a14:useLocalDpi xmlns:a14="http://schemas.microsoft.com/office/drawing/2010/main" val="0"/>
-                        </a:ext>
-                      </a:extLst>
-                    </a:blip>
-                    <a:srcRect/>
+                    <a:blip r:embed="rId9"/>
                     <a:stretch>
                       <a:fillRect/>
                     </a:stretch>
                   </pic:blipFill>
-                  <pic:spPr bwMode="auto">
+                  <pic:spPr>
                     <a:xfrm>
                       <a:off x="0" y="0"/>
-                      <a:ext cx="5486400" cy="3768090"/>
+                      <a:ext cx="4738430" cy="2001768"/>
                     </a:xfrm>
                     <a:prstGeom prst="rect">
                       <a:avLst/>
                     </a:prstGeom>
-                    <a:noFill/>
-                    <a:ln>
-                      <a:noFill/>
-                    </a:ln>
+                  </pic:spPr>
+                </pic:pic>
+              </a:graphicData>
+            </a:graphic>
+          </wp:inline>
+        </w:drawing>
+      </w:r>
+    </w:p>
+    <w:p>
+      <w:pPr>
+        <w:spacing w:before="100" w:beforeAutospacing="1" w:after="100" w:afterAutospacing="1" w:line="240" w:lineRule="auto"/>
+        <w:rPr>
+          <w:rFonts w:ascii="Times New Roman" w:eastAsia="Times New Roman" w:hAnsi="Times New Roman" w:cs="Times New Roman"/>
+          <w:sz w:val="24"/>
+          <w:szCs w:val="24"/>
+          <w:lang w:val="pt-BR" w:eastAsia="pt-BR"/>
+        </w:rPr>
+      </w:pPr>
+    </w:p>
+    <w:p>
+      <w:pPr>
+        <w:pStyle w:val="Heading3"/>
+        <w:rPr>
+          <w:lang w:val="pt-BR" w:eastAsia="pt-BR"/>
+        </w:rPr>
+      </w:pPr>
+      <w:bookmarkStart w:id="11" w:name="_Toc214282405"/>
+      <w:r>
+        <w:rPr>
+          <w:lang w:val="pt-BR" w:eastAsia="pt-BR"/>
+        </w:rPr>
+        <w:lastRenderedPageBreak/>
+        <w:t>Alerta</w:t>
+      </w:r>
+      <w:r>
+        <w:rPr>
+          <w:lang w:val="pt-BR" w:eastAsia="pt-BR"/>
+        </w:rPr>
+        <w:t>s</w:t>
+      </w:r>
+      <w:r>
+        <w:rPr>
+          <w:lang w:val="pt-BR" w:eastAsia="pt-BR"/>
+        </w:rPr>
+        <w:t>:</w:t>
+      </w:r>
+      <w:bookmarkEnd w:id="11"/>
+    </w:p>
+    <w:p>
+      <w:pPr>
+        <w:spacing w:before="100" w:beforeAutospacing="1" w:after="100" w:afterAutospacing="1" w:line="240" w:lineRule="auto"/>
+        <w:rPr>
+          <w:rFonts w:ascii="Times New Roman" w:eastAsia="Times New Roman" w:hAnsi="Times New Roman" w:cs="Times New Roman"/>
+          <w:sz w:val="24"/>
+          <w:szCs w:val="24"/>
+          <w:lang w:val="pt-BR" w:eastAsia="pt-BR"/>
+        </w:rPr>
+      </w:pPr>
+      <w:r>
+        <w:rPr>
+          <w:rFonts w:ascii="Times New Roman" w:eastAsia="Times New Roman" w:hAnsi="Times New Roman" w:cs="Times New Roman"/>
+          <w:sz w:val="24"/>
+          <w:szCs w:val="24"/>
+          <w:lang w:val="pt-BR" w:eastAsia="pt-BR"/>
+        </w:rPr>
+        <w:drawing>
+          <wp:inline distT="0" distB="0" distL="0" distR="0" wp14:anchorId="2CD4943B" wp14:editId="6A7B67A0">
+            <wp:extent cx="5486400" cy="2552700"/>
+            <wp:effectExtent l="0" t="0" r="0" b="0"/>
+            <wp:docPr id="8" name="Picture 8"/>
+            <wp:cNvGraphicFramePr>
+              <a:graphicFrameLocks xmlns:a="http://schemas.openxmlformats.org/drawingml/2006/main" noChangeAspect="1"/>
+            </wp:cNvGraphicFramePr>
+            <a:graphic xmlns:a="http://schemas.openxmlformats.org/drawingml/2006/main">
+              <a:graphicData uri="http://schemas.openxmlformats.org/drawingml/2006/picture">
+                <pic:pic xmlns:pic="http://schemas.openxmlformats.org/drawingml/2006/picture">
+                  <pic:nvPicPr>
+                    <pic:cNvPr id="1" name=""/>
+                    <pic:cNvPicPr/>
+                  </pic:nvPicPr>
+                  <pic:blipFill>
+                    <a:blip r:embed="rId10"/>
+                    <a:stretch>
+                      <a:fillRect/>
+                    </a:stretch>
+                  </pic:blipFill>
+                  <pic:spPr>
+                    <a:xfrm>
+                      <a:off x="0" y="0"/>
+                      <a:ext cx="5486400" cy="2552700"/>
+                    </a:xfrm>
+                    <a:prstGeom prst="rect">
+                      <a:avLst/>
+                    </a:prstGeom>
                   </pic:spPr>
                 </pic:pic>
               </a:graphicData>
@@ -1538,17 +3184,15 @@
       <w:r>
         <w:rPr>
           <w:rFonts w:ascii="Times New Roman" w:eastAsia="Times New Roman" w:hAnsi="Times New Roman" w:cs="Times New Roman"/>
-          <w:noProof/>
           <w:sz w:val="24"/>
           <w:szCs w:val="24"/>
           <w:lang w:val="pt-BR" w:eastAsia="pt-BR"/>
         </w:rPr>
-        <w:lastRenderedPageBreak/>
         <w:drawing>
-          <wp:inline distT="0" distB="0" distL="0" distR="0" wp14:anchorId="03FB0D58" wp14:editId="29D909B4">
-            <wp:extent cx="5486400" cy="3784600"/>
-            <wp:effectExtent l="0" t="0" r="0" b="6350"/>
-            <wp:docPr id="3" name="Picture 3"/>
+          <wp:inline distT="0" distB="0" distL="0" distR="0" wp14:anchorId="2EAA8BF5" wp14:editId="485FECCF">
+            <wp:extent cx="5486400" cy="2514600"/>
+            <wp:effectExtent l="0" t="0" r="0" b="0"/>
+            <wp:docPr id="9" name="Picture 9"/>
             <wp:cNvGraphicFramePr>
               <a:graphicFrameLocks xmlns:a="http://schemas.openxmlformats.org/drawingml/2006/main" noChangeAspect="1"/>
             </wp:cNvGraphicFramePr>
@@ -1556,36 +3200,389 @@
               <a:graphicData uri="http://schemas.openxmlformats.org/drawingml/2006/picture">
                 <pic:pic xmlns:pic="http://schemas.openxmlformats.org/drawingml/2006/picture">
                   <pic:nvPicPr>
-                    <pic:cNvPr id="0" name="Picture 5"/>
-                    <pic:cNvPicPr>
-                      <a:picLocks noChangeAspect="1" noChangeArrowheads="1"/>
-                    </pic:cNvPicPr>
+                    <pic:cNvPr id="1" name=""/>
+                    <pic:cNvPicPr/>
                   </pic:nvPicPr>
                   <pic:blipFill>
-                    <a:blip r:embed="rId8">
-                      <a:extLst>
-                        <a:ext uri="{28A0092B-C50C-407E-A947-70E740481C1C}">
-                          <a14:useLocalDpi xmlns:a14="http://schemas.microsoft.com/office/drawing/2010/main" val="0"/>
-                        </a:ext>
-                      </a:extLst>
-                    </a:blip>
-                    <a:srcRect/>
+                    <a:blip r:embed="rId11"/>
                     <a:stretch>
                       <a:fillRect/>
                     </a:stretch>
                   </pic:blipFill>
-                  <pic:spPr bwMode="auto">
+                  <pic:spPr>
                     <a:xfrm>
                       <a:off x="0" y="0"/>
-                      <a:ext cx="5486400" cy="3784600"/>
+                      <a:ext cx="5486400" cy="2514600"/>
                     </a:xfrm>
                     <a:prstGeom prst="rect">
                       <a:avLst/>
                     </a:prstGeom>
-                    <a:noFill/>
-                    <a:ln>
-                      <a:noFill/>
-                    </a:ln>
+                  </pic:spPr>
+                </pic:pic>
+              </a:graphicData>
+            </a:graphic>
+          </wp:inline>
+        </w:drawing>
+      </w:r>
+    </w:p>
+    <w:p>
+      <w:pPr>
+        <w:spacing w:before="100" w:beforeAutospacing="1" w:after="100" w:afterAutospacing="1" w:line="240" w:lineRule="auto"/>
+        <w:rPr>
+          <w:rFonts w:ascii="Times New Roman" w:eastAsia="Times New Roman" w:hAnsi="Times New Roman" w:cs="Times New Roman"/>
+          <w:sz w:val="24"/>
+          <w:szCs w:val="24"/>
+          <w:lang w:val="pt-BR" w:eastAsia="pt-BR"/>
+        </w:rPr>
+      </w:pPr>
+    </w:p>
+    <w:p>
+      <w:pPr>
+        <w:spacing w:before="100" w:beforeAutospacing="1" w:after="100" w:afterAutospacing="1" w:line="240" w:lineRule="auto"/>
+        <w:rPr>
+          <w:rFonts w:ascii="Times New Roman" w:eastAsia="Times New Roman" w:hAnsi="Times New Roman" w:cs="Times New Roman"/>
+          <w:sz w:val="24"/>
+          <w:szCs w:val="24"/>
+          <w:lang w:val="pt-BR" w:eastAsia="pt-BR"/>
+        </w:rPr>
+      </w:pPr>
+      <w:r>
+        <w:rPr>
+          <w:rFonts w:ascii="Times New Roman" w:eastAsia="Times New Roman" w:hAnsi="Times New Roman" w:cs="Times New Roman"/>
+          <w:sz w:val="24"/>
+          <w:szCs w:val="24"/>
+          <w:lang w:val="pt-BR" w:eastAsia="pt-BR"/>
+        </w:rPr>
+        <w:lastRenderedPageBreak/>
+        <w:drawing>
+          <wp:inline distT="0" distB="0" distL="0" distR="0" wp14:anchorId="1D489925" wp14:editId="31AFCEAD">
+            <wp:extent cx="5486400" cy="2338705"/>
+            <wp:effectExtent l="0" t="0" r="0" b="4445"/>
+            <wp:docPr id="10" name="Picture 10"/>
+            <wp:cNvGraphicFramePr>
+              <a:graphicFrameLocks xmlns:a="http://schemas.openxmlformats.org/drawingml/2006/main" noChangeAspect="1"/>
+            </wp:cNvGraphicFramePr>
+            <a:graphic xmlns:a="http://schemas.openxmlformats.org/drawingml/2006/main">
+              <a:graphicData uri="http://schemas.openxmlformats.org/drawingml/2006/picture">
+                <pic:pic xmlns:pic="http://schemas.openxmlformats.org/drawingml/2006/picture">
+                  <pic:nvPicPr>
+                    <pic:cNvPr id="1" name=""/>
+                    <pic:cNvPicPr/>
+                  </pic:nvPicPr>
+                  <pic:blipFill>
+                    <a:blip r:embed="rId12"/>
+                    <a:stretch>
+                      <a:fillRect/>
+                    </a:stretch>
+                  </pic:blipFill>
+                  <pic:spPr>
+                    <a:xfrm>
+                      <a:off x="0" y="0"/>
+                      <a:ext cx="5486400" cy="2338705"/>
+                    </a:xfrm>
+                    <a:prstGeom prst="rect">
+                      <a:avLst/>
+                    </a:prstGeom>
+                  </pic:spPr>
+                </pic:pic>
+              </a:graphicData>
+            </a:graphic>
+          </wp:inline>
+        </w:drawing>
+      </w:r>
+    </w:p>
+    <w:p>
+      <w:pPr>
+        <w:pStyle w:val="Heading2"/>
+        <w:rPr>
+          <w:lang w:val="pt-BR" w:eastAsia="pt-BR"/>
+        </w:rPr>
+      </w:pPr>
+      <w:bookmarkStart w:id="12" w:name="_Toc214282406"/>
+      <w:r>
+        <w:rPr>
+          <w:lang w:val="pt-BR" w:eastAsia="pt-BR"/>
+        </w:rPr>
+        <w:t>Checkin:</w:t>
+      </w:r>
+      <w:bookmarkEnd w:id="12"/>
+      <w:r>
+        <w:rPr>
+          <w:lang w:val="pt-BR" w:eastAsia="pt-BR"/>
+        </w:rPr>
+        <w:t xml:space="preserve"> </w:t>
+      </w:r>
+    </w:p>
+    <w:p>
+      <w:pPr>
+        <w:spacing w:before="100" w:beforeAutospacing="1" w:after="100" w:afterAutospacing="1" w:line="240" w:lineRule="auto"/>
+        <w:rPr>
+          <w:rFonts w:ascii="Times New Roman" w:eastAsia="Times New Roman" w:hAnsi="Times New Roman" w:cs="Times New Roman"/>
+          <w:sz w:val="24"/>
+          <w:szCs w:val="24"/>
+          <w:lang w:val="pt-BR" w:eastAsia="pt-BR"/>
+        </w:rPr>
+      </w:pPr>
+      <w:r>
+        <w:rPr>
+          <w:rFonts w:ascii="Times New Roman" w:eastAsia="Times New Roman" w:hAnsi="Times New Roman" w:cs="Times New Roman"/>
+          <w:sz w:val="24"/>
+          <w:szCs w:val="24"/>
+          <w:lang w:val="pt-BR" w:eastAsia="pt-BR"/>
+        </w:rPr>
+        <w:drawing>
+          <wp:inline distT="0" distB="0" distL="0" distR="0" wp14:anchorId="6564F722" wp14:editId="6492F821">
+            <wp:extent cx="4691074" cy="2209800"/>
+            <wp:effectExtent l="0" t="0" r="0" b="0"/>
+            <wp:docPr id="14" name="Picture 14"/>
+            <wp:cNvGraphicFramePr>
+              <a:graphicFrameLocks xmlns:a="http://schemas.openxmlformats.org/drawingml/2006/main" noChangeAspect="1"/>
+            </wp:cNvGraphicFramePr>
+            <a:graphic xmlns:a="http://schemas.openxmlformats.org/drawingml/2006/main">
+              <a:graphicData uri="http://schemas.openxmlformats.org/drawingml/2006/picture">
+                <pic:pic xmlns:pic="http://schemas.openxmlformats.org/drawingml/2006/picture">
+                  <pic:nvPicPr>
+                    <pic:cNvPr id="1" name=""/>
+                    <pic:cNvPicPr/>
+                  </pic:nvPicPr>
+                  <pic:blipFill>
+                    <a:blip r:embed="rId13"/>
+                    <a:stretch>
+                      <a:fillRect/>
+                    </a:stretch>
+                  </pic:blipFill>
+                  <pic:spPr>
+                    <a:xfrm>
+                      <a:off x="0" y="0"/>
+                      <a:ext cx="4698564" cy="2213328"/>
+                    </a:xfrm>
+                    <a:prstGeom prst="rect">
+                      <a:avLst/>
+                    </a:prstGeom>
+                  </pic:spPr>
+                </pic:pic>
+              </a:graphicData>
+            </a:graphic>
+          </wp:inline>
+        </w:drawing>
+      </w:r>
+    </w:p>
+    <w:p>
+      <w:pPr>
+        <w:spacing w:before="100" w:beforeAutospacing="1" w:after="100" w:afterAutospacing="1" w:line="240" w:lineRule="auto"/>
+        <w:rPr>
+          <w:rFonts w:ascii="Times New Roman" w:eastAsia="Times New Roman" w:hAnsi="Times New Roman" w:cs="Times New Roman"/>
+          <w:sz w:val="24"/>
+          <w:szCs w:val="24"/>
+          <w:lang w:val="pt-BR" w:eastAsia="pt-BR"/>
+        </w:rPr>
+      </w:pPr>
+    </w:p>
+    <w:p>
+      <w:pPr>
+        <w:spacing w:before="100" w:beforeAutospacing="1" w:after="100" w:afterAutospacing="1" w:line="240" w:lineRule="auto"/>
+        <w:rPr>
+          <w:rFonts w:ascii="Times New Roman" w:eastAsia="Times New Roman" w:hAnsi="Times New Roman" w:cs="Times New Roman"/>
+          <w:sz w:val="24"/>
+          <w:szCs w:val="24"/>
+          <w:lang w:val="pt-BR" w:eastAsia="pt-BR"/>
+        </w:rPr>
+      </w:pPr>
+      <w:r>
+        <w:rPr>
+          <w:rFonts w:ascii="Times New Roman" w:eastAsia="Times New Roman" w:hAnsi="Times New Roman" w:cs="Times New Roman"/>
+          <w:sz w:val="24"/>
+          <w:szCs w:val="24"/>
+          <w:lang w:val="pt-BR" w:eastAsia="pt-BR"/>
+        </w:rPr>
+        <w:drawing>
+          <wp:inline distT="0" distB="0" distL="0" distR="0" wp14:anchorId="2DD798D3" wp14:editId="18181B31">
+            <wp:extent cx="4711690" cy="1981200"/>
+            <wp:effectExtent l="0" t="0" r="0" b="0"/>
+            <wp:docPr id="15" name="Picture 15"/>
+            <wp:cNvGraphicFramePr>
+              <a:graphicFrameLocks xmlns:a="http://schemas.openxmlformats.org/drawingml/2006/main" noChangeAspect="1"/>
+            </wp:cNvGraphicFramePr>
+            <a:graphic xmlns:a="http://schemas.openxmlformats.org/drawingml/2006/main">
+              <a:graphicData uri="http://schemas.openxmlformats.org/drawingml/2006/picture">
+                <pic:pic xmlns:pic="http://schemas.openxmlformats.org/drawingml/2006/picture">
+                  <pic:nvPicPr>
+                    <pic:cNvPr id="1" name=""/>
+                    <pic:cNvPicPr/>
+                  </pic:nvPicPr>
+                  <pic:blipFill>
+                    <a:blip r:embed="rId14"/>
+                    <a:stretch>
+                      <a:fillRect/>
+                    </a:stretch>
+                  </pic:blipFill>
+                  <pic:spPr>
+                    <a:xfrm>
+                      <a:off x="0" y="0"/>
+                      <a:ext cx="4719160" cy="1984341"/>
+                    </a:xfrm>
+                    <a:prstGeom prst="rect">
+                      <a:avLst/>
+                    </a:prstGeom>
+                  </pic:spPr>
+                </pic:pic>
+              </a:graphicData>
+            </a:graphic>
+          </wp:inline>
+        </w:drawing>
+      </w:r>
+    </w:p>
+    <w:p>
+      <w:pPr>
+        <w:spacing w:before="100" w:beforeAutospacing="1" w:after="100" w:afterAutospacing="1" w:line="240" w:lineRule="auto"/>
+        <w:rPr>
+          <w:rFonts w:ascii="Times New Roman" w:eastAsia="Times New Roman" w:hAnsi="Times New Roman" w:cs="Times New Roman"/>
+          <w:sz w:val="24"/>
+          <w:szCs w:val="24"/>
+          <w:lang w:val="pt-BR" w:eastAsia="pt-BR"/>
+        </w:rPr>
+      </w:pPr>
+    </w:p>
+    <w:p>
+      <w:pPr>
+        <w:spacing w:before="100" w:beforeAutospacing="1" w:after="100" w:afterAutospacing="1" w:line="240" w:lineRule="auto"/>
+        <w:rPr>
+          <w:rFonts w:ascii="Times New Roman" w:eastAsia="Times New Roman" w:hAnsi="Times New Roman" w:cs="Times New Roman"/>
+          <w:sz w:val="24"/>
+          <w:szCs w:val="24"/>
+          <w:lang w:val="pt-BR" w:eastAsia="pt-BR"/>
+        </w:rPr>
+      </w:pPr>
+      <w:r>
+        <w:rPr>
+          <w:rFonts w:ascii="Times New Roman" w:eastAsia="Times New Roman" w:hAnsi="Times New Roman" w:cs="Times New Roman"/>
+          <w:sz w:val="24"/>
+          <w:szCs w:val="24"/>
+          <w:lang w:val="pt-BR" w:eastAsia="pt-BR"/>
+        </w:rPr>
+        <w:lastRenderedPageBreak/>
+        <w:drawing>
+          <wp:inline distT="0" distB="0" distL="0" distR="0" wp14:anchorId="6D1E1593" wp14:editId="13CFBD79">
+            <wp:extent cx="4724400" cy="1900697"/>
+            <wp:effectExtent l="0" t="0" r="0" b="4445"/>
+            <wp:docPr id="16" name="Picture 16"/>
+            <wp:cNvGraphicFramePr>
+              <a:graphicFrameLocks xmlns:a="http://schemas.openxmlformats.org/drawingml/2006/main" noChangeAspect="1"/>
+            </wp:cNvGraphicFramePr>
+            <a:graphic xmlns:a="http://schemas.openxmlformats.org/drawingml/2006/main">
+              <a:graphicData uri="http://schemas.openxmlformats.org/drawingml/2006/picture">
+                <pic:pic xmlns:pic="http://schemas.openxmlformats.org/drawingml/2006/picture">
+                  <pic:nvPicPr>
+                    <pic:cNvPr id="1" name=""/>
+                    <pic:cNvPicPr/>
+                  </pic:nvPicPr>
+                  <pic:blipFill>
+                    <a:blip r:embed="rId15"/>
+                    <a:stretch>
+                      <a:fillRect/>
+                    </a:stretch>
+                  </pic:blipFill>
+                  <pic:spPr>
+                    <a:xfrm>
+                      <a:off x="0" y="0"/>
+                      <a:ext cx="4735444" cy="1905140"/>
+                    </a:xfrm>
+                    <a:prstGeom prst="rect">
+                      <a:avLst/>
+                    </a:prstGeom>
+                  </pic:spPr>
+                </pic:pic>
+              </a:graphicData>
+            </a:graphic>
+          </wp:inline>
+        </w:drawing>
+      </w:r>
+    </w:p>
+    <w:p>
+      <w:pPr>
+        <w:spacing w:before="100" w:beforeAutospacing="1" w:after="100" w:afterAutospacing="1" w:line="240" w:lineRule="auto"/>
+        <w:rPr>
+          <w:rFonts w:ascii="Times New Roman" w:eastAsia="Times New Roman" w:hAnsi="Times New Roman" w:cs="Times New Roman"/>
+          <w:sz w:val="24"/>
+          <w:szCs w:val="24"/>
+          <w:lang w:val="pt-BR" w:eastAsia="pt-BR"/>
+        </w:rPr>
+      </w:pPr>
+    </w:p>
+    <w:p>
+      <w:pPr>
+        <w:pStyle w:val="Heading2"/>
+        <w:rPr>
+          <w:lang w:val="pt-BR" w:eastAsia="pt-BR"/>
+        </w:rPr>
+      </w:pPr>
+      <w:bookmarkStart w:id="13" w:name="_Toc214282407"/>
+      <w:r>
+        <w:rPr>
+          <w:lang w:val="pt-BR" w:eastAsia="pt-BR"/>
+        </w:rPr>
+        <w:t>R</w:t>
+      </w:r>
+      <w:r>
+        <w:rPr>
+          <w:lang w:val="pt-BR" w:eastAsia="pt-BR"/>
+        </w:rPr>
+        <w:t>elatório</w:t>
+      </w:r>
+      <w:r>
+        <w:rPr>
+          <w:lang w:val="pt-BR" w:eastAsia="pt-BR"/>
+        </w:rPr>
+        <w:t>:</w:t>
+      </w:r>
+      <w:bookmarkEnd w:id="13"/>
+    </w:p>
+    <w:p>
+      <w:pPr>
+        <w:spacing w:before="100" w:beforeAutospacing="1" w:after="100" w:afterAutospacing="1" w:line="240" w:lineRule="auto"/>
+        <w:rPr>
+          <w:rFonts w:ascii="Times New Roman" w:eastAsia="Times New Roman" w:hAnsi="Times New Roman" w:cs="Times New Roman"/>
+          <w:sz w:val="24"/>
+          <w:szCs w:val="24"/>
+          <w:lang w:val="pt-BR" w:eastAsia="pt-BR"/>
+        </w:rPr>
+      </w:pPr>
+      <w:r>
+        <w:rPr>
+          <w:rFonts w:ascii="Times New Roman" w:eastAsia="Times New Roman" w:hAnsi="Times New Roman" w:cs="Times New Roman"/>
+          <w:sz w:val="24"/>
+          <w:szCs w:val="24"/>
+          <w:lang w:val="pt-BR" w:eastAsia="pt-BR"/>
+        </w:rPr>
+        <w:drawing>
+          <wp:inline distT="0" distB="0" distL="0" distR="0" wp14:anchorId="13B92A93" wp14:editId="307B7256">
+            <wp:extent cx="5134586" cy="2400300"/>
+            <wp:effectExtent l="0" t="0" r="9525" b="0"/>
+            <wp:docPr id="17" name="Picture 17"/>
+            <wp:cNvGraphicFramePr>
+              <a:graphicFrameLocks xmlns:a="http://schemas.openxmlformats.org/drawingml/2006/main" noChangeAspect="1"/>
+            </wp:cNvGraphicFramePr>
+            <a:graphic xmlns:a="http://schemas.openxmlformats.org/drawingml/2006/main">
+              <a:graphicData uri="http://schemas.openxmlformats.org/drawingml/2006/picture">
+                <pic:pic xmlns:pic="http://schemas.openxmlformats.org/drawingml/2006/picture">
+                  <pic:nvPicPr>
+                    <pic:cNvPr id="1" name=""/>
+                    <pic:cNvPicPr/>
+                  </pic:nvPicPr>
+                  <pic:blipFill>
+                    <a:blip r:embed="rId16"/>
+                    <a:stretch>
+                      <a:fillRect/>
+                    </a:stretch>
+                  </pic:blipFill>
+                  <pic:spPr>
+                    <a:xfrm>
+                      <a:off x="0" y="0"/>
+                      <a:ext cx="5139429" cy="2402564"/>
+                    </a:xfrm>
+                    <a:prstGeom prst="rect">
+                      <a:avLst/>
+                    </a:prstGeom>
                   </pic:spPr>
                 </pic:pic>
               </a:graphicData>
@@ -1607,16 +3604,15 @@
       <w:r>
         <w:rPr>
           <w:rFonts w:ascii="Times New Roman" w:eastAsia="Times New Roman" w:hAnsi="Times New Roman" w:cs="Times New Roman"/>
-          <w:noProof/>
           <w:sz w:val="24"/>
           <w:szCs w:val="24"/>
           <w:lang w:val="pt-BR" w:eastAsia="pt-BR"/>
         </w:rPr>
         <w:drawing>
-          <wp:inline distT="0" distB="0" distL="0" distR="0" wp14:anchorId="5B42AB8A" wp14:editId="243725F7">
-            <wp:extent cx="5486400" cy="3938270"/>
-            <wp:effectExtent l="0" t="0" r="0" b="5080"/>
-            <wp:docPr id="4" name="Picture 4"/>
+          <wp:inline distT="0" distB="0" distL="0" distR="0" wp14:anchorId="0C4FD412" wp14:editId="3E18CF91">
+            <wp:extent cx="5111151" cy="2257425"/>
+            <wp:effectExtent l="0" t="0" r="0" b="0"/>
+            <wp:docPr id="18" name="Picture 18"/>
             <wp:cNvGraphicFramePr>
               <a:graphicFrameLocks xmlns:a="http://schemas.openxmlformats.org/drawingml/2006/main" noChangeAspect="1"/>
             </wp:cNvGraphicFramePr>
@@ -1624,36 +3620,23 @@
               <a:graphicData uri="http://schemas.openxmlformats.org/drawingml/2006/picture">
                 <pic:pic xmlns:pic="http://schemas.openxmlformats.org/drawingml/2006/picture">
                   <pic:nvPicPr>
-                    <pic:cNvPr id="0" name="Picture 7"/>
-                    <pic:cNvPicPr>
-                      <a:picLocks noChangeAspect="1" noChangeArrowheads="1"/>
-                    </pic:cNvPicPr>
+                    <pic:cNvPr id="1" name=""/>
+                    <pic:cNvPicPr/>
                   </pic:nvPicPr>
                   <pic:blipFill>
-                    <a:blip r:embed="rId9">
-                      <a:extLst>
-                        <a:ext uri="{28A0092B-C50C-407E-A947-70E740481C1C}">
-                          <a14:useLocalDpi xmlns:a14="http://schemas.microsoft.com/office/drawing/2010/main" val="0"/>
-                        </a:ext>
-                      </a:extLst>
-                    </a:blip>
-                    <a:srcRect/>
+                    <a:blip r:embed="rId17"/>
                     <a:stretch>
                       <a:fillRect/>
                     </a:stretch>
                   </pic:blipFill>
-                  <pic:spPr bwMode="auto">
+                  <pic:spPr>
                     <a:xfrm>
                       <a:off x="0" y="0"/>
-                      <a:ext cx="5486400" cy="3938270"/>
+                      <a:ext cx="5111540" cy="2257597"/>
                     </a:xfrm>
                     <a:prstGeom prst="rect">
                       <a:avLst/>
                     </a:prstGeom>
-                    <a:noFill/>
-                    <a:ln>
-                      <a:noFill/>
-                    </a:ln>
                   </pic:spPr>
                 </pic:pic>
               </a:graphicData>
@@ -1661,6 +3644,94 @@
           </wp:inline>
         </w:drawing>
       </w:r>
+    </w:p>
+    <w:p>
+      <w:pPr>
+        <w:spacing w:before="100" w:beforeAutospacing="1" w:after="100" w:afterAutospacing="1" w:line="240" w:lineRule="auto"/>
+        <w:rPr>
+          <w:rFonts w:ascii="Times New Roman" w:eastAsia="Times New Roman" w:hAnsi="Times New Roman" w:cs="Times New Roman"/>
+          <w:sz w:val="24"/>
+          <w:szCs w:val="24"/>
+          <w:lang w:val="pt-BR" w:eastAsia="pt-BR"/>
+        </w:rPr>
+      </w:pPr>
+      <w:r>
+        <w:rPr>
+          <w:rFonts w:ascii="Times New Roman" w:eastAsia="Times New Roman" w:hAnsi="Times New Roman" w:cs="Times New Roman"/>
+          <w:sz w:val="24"/>
+          <w:szCs w:val="24"/>
+          <w:lang w:val="pt-BR" w:eastAsia="pt-BR"/>
+        </w:rPr>
+        <w:lastRenderedPageBreak/>
+        <w:drawing>
+          <wp:inline distT="0" distB="0" distL="0" distR="0" wp14:anchorId="746360E7" wp14:editId="371EF60C">
+            <wp:extent cx="5486400" cy="2003425"/>
+            <wp:effectExtent l="0" t="0" r="0" b="0"/>
+            <wp:docPr id="19" name="Picture 19"/>
+            <wp:cNvGraphicFramePr>
+              <a:graphicFrameLocks xmlns:a="http://schemas.openxmlformats.org/drawingml/2006/main" noChangeAspect="1"/>
+            </wp:cNvGraphicFramePr>
+            <a:graphic xmlns:a="http://schemas.openxmlformats.org/drawingml/2006/main">
+              <a:graphicData uri="http://schemas.openxmlformats.org/drawingml/2006/picture">
+                <pic:pic xmlns:pic="http://schemas.openxmlformats.org/drawingml/2006/picture">
+                  <pic:nvPicPr>
+                    <pic:cNvPr id="1" name=""/>
+                    <pic:cNvPicPr/>
+                  </pic:nvPicPr>
+                  <pic:blipFill>
+                    <a:blip r:embed="rId18"/>
+                    <a:stretch>
+                      <a:fillRect/>
+                    </a:stretch>
+                  </pic:blipFill>
+                  <pic:spPr>
+                    <a:xfrm>
+                      <a:off x="0" y="0"/>
+                      <a:ext cx="5486400" cy="2003425"/>
+                    </a:xfrm>
+                    <a:prstGeom prst="rect">
+                      <a:avLst/>
+                    </a:prstGeom>
+                  </pic:spPr>
+                </pic:pic>
+              </a:graphicData>
+            </a:graphic>
+          </wp:inline>
+        </w:drawing>
+      </w:r>
+    </w:p>
+    <w:p>
+      <w:pPr>
+        <w:spacing w:before="100" w:beforeAutospacing="1" w:after="100" w:afterAutospacing="1" w:line="240" w:lineRule="auto"/>
+        <w:rPr>
+          <w:rFonts w:ascii="Times New Roman" w:eastAsia="Times New Roman" w:hAnsi="Times New Roman" w:cs="Times New Roman"/>
+          <w:sz w:val="24"/>
+          <w:szCs w:val="24"/>
+          <w:lang w:val="pt-BR" w:eastAsia="pt-BR"/>
+        </w:rPr>
+      </w:pPr>
+    </w:p>
+    <w:p>
+      <w:pPr>
+        <w:spacing w:before="100" w:beforeAutospacing="1" w:after="100" w:afterAutospacing="1" w:line="240" w:lineRule="auto"/>
+        <w:rPr>
+          <w:rFonts w:ascii="Times New Roman" w:eastAsia="Times New Roman" w:hAnsi="Times New Roman" w:cs="Times New Roman"/>
+          <w:sz w:val="24"/>
+          <w:szCs w:val="24"/>
+          <w:lang w:val="pt-BR" w:eastAsia="pt-BR"/>
+        </w:rPr>
+      </w:pPr>
+    </w:p>
+    <w:p>
+      <w:pPr>
+        <w:spacing w:before="100" w:beforeAutospacing="1" w:after="100" w:afterAutospacing="1" w:line="240" w:lineRule="auto"/>
+        <w:rPr>
+          <w:rFonts w:ascii="Times New Roman" w:eastAsia="Times New Roman" w:hAnsi="Times New Roman" w:cs="Times New Roman"/>
+          <w:sz w:val="24"/>
+          <w:szCs w:val="24"/>
+          <w:lang w:val="pt-BR" w:eastAsia="pt-BR"/>
+        </w:rPr>
+      </w:pPr>
     </w:p>
     <w:p>
       <w:pPr>
@@ -1697,6 +3768,7 @@
           <w:lang w:val="pt-BR"/>
         </w:rPr>
       </w:pPr>
+      <w:bookmarkStart w:id="14" w:name="_Toc214282408"/>
       <w:r>
         <w:rPr>
           <w:rFonts w:ascii="Arial" w:hAnsi="Arial" w:cs="Arial"/>
@@ -1704,29 +3776,77 @@
           <w:szCs w:val="28"/>
           <w:lang w:val="pt-BR"/>
         </w:rPr>
-        <w:t xml:space="preserve">6. Modelo de </w:t>
+        <w:lastRenderedPageBreak/>
+        <w:t>6. Modelo de Entidade-Relacionamento (MER)</w:t>
       </w:r>
-      <w:r>
-        <w:rPr>
-          <w:rFonts w:ascii="Arial" w:hAnsi="Arial" w:cs="Arial"/>
-          <w:sz w:val="28"/>
-          <w:szCs w:val="28"/>
-          <w:lang w:val="pt-BR"/>
-        </w:rPr>
-        <w:t>Entidade-Relacionamento (MER)</w:t>
-      </w:r>
+      <w:bookmarkEnd w:id="14"/>
     </w:p>
     <w:p>
       <w:pPr>
+        <w:spacing w:before="100" w:beforeAutospacing="1" w:after="100" w:afterAutospacing="1" w:line="240" w:lineRule="auto"/>
         <w:rPr>
-          <w:lang w:val="pt-BR"/>
+          <w:rFonts w:ascii="Times New Roman" w:eastAsia="Times New Roman" w:hAnsi="Times New Roman" w:cs="Times New Roman"/>
+          <w:sz w:val="24"/>
+          <w:szCs w:val="24"/>
+          <w:lang w:val="pt-BR" w:eastAsia="pt-BR"/>
         </w:rPr>
       </w:pPr>
       <w:r>
         <w:rPr>
-          <w:lang w:val="pt-BR"/>
+          <w:rFonts w:ascii="Times New Roman" w:eastAsia="Times New Roman" w:hAnsi="Times New Roman" w:cs="Times New Roman"/>
+          <w:noProof/>
+          <w:sz w:val="24"/>
+          <w:szCs w:val="24"/>
+          <w:lang w:val="pt-BR" w:eastAsia="pt-BR"/>
         </w:rPr>
-        <w:t>(Inserir imagem do MER)</w:t>
+        <w:drawing>
+          <wp:inline distT="0" distB="0" distL="0" distR="0" wp14:anchorId="75A21335" wp14:editId="5DC9D1A1">
+            <wp:extent cx="5486400" cy="4796790"/>
+            <wp:effectExtent l="0" t="0" r="0" b="3810"/>
+            <wp:docPr id="21" name="Picture 21"/>
+            <wp:cNvGraphicFramePr>
+              <a:graphicFrameLocks xmlns:a="http://schemas.openxmlformats.org/drawingml/2006/main" noChangeAspect="1"/>
+            </wp:cNvGraphicFramePr>
+            <a:graphic xmlns:a="http://schemas.openxmlformats.org/drawingml/2006/main">
+              <a:graphicData uri="http://schemas.openxmlformats.org/drawingml/2006/picture">
+                <pic:pic xmlns:pic="http://schemas.openxmlformats.org/drawingml/2006/picture">
+                  <pic:nvPicPr>
+                    <pic:cNvPr id="0" name="Picture 3"/>
+                    <pic:cNvPicPr>
+                      <a:picLocks noChangeAspect="1" noChangeArrowheads="1"/>
+                    </pic:cNvPicPr>
+                  </pic:nvPicPr>
+                  <pic:blipFill>
+                    <a:blip r:embed="rId19">
+                      <a:extLst>
+                        <a:ext uri="{28A0092B-C50C-407E-A947-70E740481C1C}">
+                          <a14:useLocalDpi xmlns:a14="http://schemas.microsoft.com/office/drawing/2010/main" val="0"/>
+                        </a:ext>
+                      </a:extLst>
+                    </a:blip>
+                    <a:srcRect/>
+                    <a:stretch>
+                      <a:fillRect/>
+                    </a:stretch>
+                  </pic:blipFill>
+                  <pic:spPr bwMode="auto">
+                    <a:xfrm>
+                      <a:off x="0" y="0"/>
+                      <a:ext cx="5486400" cy="4796790"/>
+                    </a:xfrm>
+                    <a:prstGeom prst="rect">
+                      <a:avLst/>
+                    </a:prstGeom>
+                    <a:noFill/>
+                    <a:ln>
+                      <a:noFill/>
+                    </a:ln>
+                  </pic:spPr>
+                </pic:pic>
+              </a:graphicData>
+            </a:graphic>
+          </wp:inline>
+        </w:drawing>
       </w:r>
     </w:p>
     <w:p>
@@ -1736,11 +3856,82 @@
           <w:lang w:val="pt-BR"/>
         </w:rPr>
       </w:pPr>
+      <w:bookmarkStart w:id="15" w:name="_Toc214282409"/>
       <w:r>
         <w:rPr>
           <w:lang w:val="pt-BR"/>
         </w:rPr>
+        <w:lastRenderedPageBreak/>
         <w:t>7. Diagrama de Classes</w:t>
+      </w:r>
+      <w:bookmarkEnd w:id="15"/>
+    </w:p>
+    <w:p>
+      <w:pPr>
+        <w:spacing w:before="100" w:beforeAutospacing="1" w:after="100" w:afterAutospacing="1" w:line="240" w:lineRule="auto"/>
+        <w:rPr>
+          <w:rFonts w:ascii="Times New Roman" w:eastAsia="Times New Roman" w:hAnsi="Times New Roman" w:cs="Times New Roman"/>
+          <w:sz w:val="24"/>
+          <w:szCs w:val="24"/>
+          <w:lang w:val="pt-BR" w:eastAsia="pt-BR"/>
+        </w:rPr>
+      </w:pPr>
+      <w:r>
+        <w:rPr>
+          <w:rFonts w:ascii="Times New Roman" w:eastAsia="Times New Roman" w:hAnsi="Times New Roman" w:cs="Times New Roman"/>
+          <w:noProof/>
+          <w:sz w:val="24"/>
+          <w:szCs w:val="24"/>
+          <w:lang w:val="pt-BR" w:eastAsia="pt-BR"/>
+        </w:rPr>
+        <w:drawing>
+          <wp:inline distT="0" distB="0" distL="0" distR="0" wp14:anchorId="13B1F917" wp14:editId="1770D390">
+            <wp:extent cx="5486400" cy="4135120"/>
+            <wp:effectExtent l="0" t="0" r="0" b="0"/>
+            <wp:docPr id="20" name="Picture 20"/>
+            <wp:cNvGraphicFramePr>
+              <a:graphicFrameLocks xmlns:a="http://schemas.openxmlformats.org/drawingml/2006/main" noChangeAspect="1"/>
+            </wp:cNvGraphicFramePr>
+            <a:graphic xmlns:a="http://schemas.openxmlformats.org/drawingml/2006/main">
+              <a:graphicData uri="http://schemas.openxmlformats.org/drawingml/2006/picture">
+                <pic:pic xmlns:pic="http://schemas.openxmlformats.org/drawingml/2006/picture">
+                  <pic:nvPicPr>
+                    <pic:cNvPr id="0" name="Picture 1"/>
+                    <pic:cNvPicPr>
+                      <a:picLocks noChangeAspect="1" noChangeArrowheads="1"/>
+                    </pic:cNvPicPr>
+                  </pic:nvPicPr>
+                  <pic:blipFill>
+                    <a:blip r:embed="rId20">
+                      <a:extLst>
+                        <a:ext uri="{28A0092B-C50C-407E-A947-70E740481C1C}">
+                          <a14:useLocalDpi xmlns:a14="http://schemas.microsoft.com/office/drawing/2010/main" val="0"/>
+                        </a:ext>
+                      </a:extLst>
+                    </a:blip>
+                    <a:srcRect/>
+                    <a:stretch>
+                      <a:fillRect/>
+                    </a:stretch>
+                  </pic:blipFill>
+                  <pic:spPr bwMode="auto">
+                    <a:xfrm>
+                      <a:off x="0" y="0"/>
+                      <a:ext cx="5486400" cy="4135120"/>
+                    </a:xfrm>
+                    <a:prstGeom prst="rect">
+                      <a:avLst/>
+                    </a:prstGeom>
+                    <a:noFill/>
+                    <a:ln>
+                      <a:noFill/>
+                    </a:ln>
+                  </pic:spPr>
+                </pic:pic>
+              </a:graphicData>
+            </a:graphic>
+          </wp:inline>
+        </w:drawing>
       </w:r>
     </w:p>
     <w:p>
@@ -1749,12 +3940,6 @@
           <w:lang w:val="pt-BR"/>
         </w:rPr>
       </w:pPr>
-      <w:r>
-        <w:rPr>
-          <w:lang w:val="pt-BR"/>
-        </w:rPr>
-        <w:t>(Inserir diagrama UML das classes)</w:t>
-      </w:r>
     </w:p>
     <w:sectPr>
       <w:pgSz w:w="12240" w:h="15840"/>
@@ -2406,11 +4591,6 @@
     <w:lsdException w:name="Book Title" w:uiPriority="33" w:qFormat="1"/>
     <w:lsdException w:name="Bibliography" w:semiHidden="1" w:uiPriority="37" w:unhideWhenUsed="1"/>
     <w:lsdException w:name="TOC Heading" w:semiHidden="1" w:uiPriority="39" w:unhideWhenUsed="1" w:qFormat="1"/>
-    <w:lsdException w:name="Plain Table 5" w:semiHidden="1" w:unhideWhenUsed="1"/>
-    <w:lsdException w:name="Grid Table Light" w:semiHidden="1" w:unhideWhenUsed="1"/>
-    <w:lsdException w:name="Grid Table 1 Light" w:semiHidden="1" w:unhideWhenUsed="1"/>
-    <w:lsdException w:name="Grid Table 2" w:semiHidden="1" w:unhideWhenUsed="1"/>
-    <w:lsdException w:name="Grid Table 3" w:semiHidden="1" w:unhideWhenUsed="1"/>
     <w:lsdException w:name="Grid Table 4" w:uiPriority="49"/>
     <w:lsdException w:name="Grid Table 5 Dark" w:uiPriority="50"/>
     <w:lsdException w:name="Grid Table 6 Colorful" w:uiPriority="51"/>
@@ -3444,7 +5624,6 @@
     <w:basedOn w:val="Heading1"/>
     <w:next w:val="Normal"/>
     <w:uiPriority w:val="39"/>
-    <w:semiHidden/>
     <w:unhideWhenUsed/>
     <w:qFormat/>
     <w:rsid w:val="00FC693F"/>
@@ -13521,6 +15700,55 @@
       <w:sz w:val="24"/>
       <w:szCs w:val="24"/>
       <w:lang w:val="pt-BR" w:eastAsia="pt-BR"/>
+    </w:rPr>
+  </w:style>
+  <w:style w:type="paragraph" w:styleId="TOC1">
+    <w:name w:val="toc 1"/>
+    <w:basedOn w:val="Normal"/>
+    <w:next w:val="Normal"/>
+    <w:autoRedefine/>
+    <w:uiPriority w:val="39"/>
+    <w:unhideWhenUsed/>
+    <w:rsid w:val="00A046CC"/>
+    <w:pPr>
+      <w:spacing w:after="100"/>
+    </w:pPr>
+  </w:style>
+  <w:style w:type="paragraph" w:styleId="TOC2">
+    <w:name w:val="toc 2"/>
+    <w:basedOn w:val="Normal"/>
+    <w:next w:val="Normal"/>
+    <w:autoRedefine/>
+    <w:uiPriority w:val="39"/>
+    <w:unhideWhenUsed/>
+    <w:rsid w:val="00A046CC"/>
+    <w:pPr>
+      <w:spacing w:after="100"/>
+      <w:ind w:left="220"/>
+    </w:pPr>
+  </w:style>
+  <w:style w:type="paragraph" w:styleId="TOC3">
+    <w:name w:val="toc 3"/>
+    <w:basedOn w:val="Normal"/>
+    <w:next w:val="Normal"/>
+    <w:autoRedefine/>
+    <w:uiPriority w:val="39"/>
+    <w:unhideWhenUsed/>
+    <w:rsid w:val="00A046CC"/>
+    <w:pPr>
+      <w:spacing w:after="100"/>
+      <w:ind w:left="440"/>
+    </w:pPr>
+  </w:style>
+  <w:style w:type="character" w:styleId="Hyperlink">
+    <w:name w:val="Hyperlink"/>
+    <w:basedOn w:val="DefaultParagraphFont"/>
+    <w:uiPriority w:val="99"/>
+    <w:unhideWhenUsed/>
+    <w:rsid w:val="00A046CC"/>
+    <w:rPr>
+      <w:color w:val="0000FF" w:themeColor="hyperlink"/>
+      <w:u w:val="single"/>
     </w:rPr>
   </w:style>
 </w:styles>

</xml_diff>